<commit_message>
Track video files with Git LFS & Humanize doc
</commit_message>
<xml_diff>
--- a/G04.docx
+++ b/G04.docx
@@ -1,6 +1,6 @@
 
 <file path=word/document.xml><?xml version="1.0" encoding="utf-8"?>
-<w:document xmlns:wpc="http://schemas.microsoft.com/office/word/2010/wordprocessingCanvas" xmlns:cx="http://schemas.microsoft.com/office/drawing/2014/chartex" xmlns:cx1="http://schemas.microsoft.com/office/drawing/2015/9/8/chartex" xmlns:cx2="http://schemas.microsoft.com/office/drawing/2015/10/21/chartex" xmlns:cx3="http://schemas.microsoft.com/office/drawing/2016/5/9/chartex" xmlns:cx4="http://schemas.microsoft.com/office/drawing/2016/5/10/chartex" xmlns:cx5="http://schemas.microsoft.com/office/drawing/2016/5/11/chartex" xmlns:cx6="http://schemas.microsoft.com/office/drawing/2016/5/12/chartex" xmlns:cx7="http://schemas.microsoft.com/office/drawing/2016/5/13/chartex" xmlns:cx8="http://schemas.microsoft.com/office/drawing/2016/5/14/chartex" xmlns:mc="http://schemas.openxmlformats.org/markup-compatibility/2006" xmlns:aink="http://schemas.microsoft.com/office/drawing/2016/ink" xmlns:am3d="http://schemas.microsoft.com/office/drawing/2017/model3d" xmlns:o="urn:schemas-microsoft-com:office:office" xmlns:oel="http://schemas.microsoft.com/office/2019/extlst" xmlns:r="http://schemas.openxmlformats.org/officeDocument/2006/relationships" xmlns:m="http://schemas.openxmlformats.org/officeDocument/2006/math" xmlns:v="urn:schemas-microsoft-com:vml" xmlns:wp14="http://schemas.microsoft.com/office/word/2010/wordprocessingDrawing" xmlns:wp="http://schemas.openxmlformats.org/drawingml/2006/wordprocessingDrawing" xmlns:w10="urn:schemas-microsoft-com:office:word" xmlns:w="http://schemas.openxmlformats.org/wordprocessingml/2006/main" xmlns:w14="http://schemas.microsoft.com/office/word/2010/wordml" xmlns:w15="http://schemas.microsoft.com/office/word/2012/wordml" xmlns:w16cex="http://schemas.microsoft.com/office/word/2018/wordml/cex" xmlns:w16cid="http://schemas.microsoft.com/office/word/2016/wordml/cid" xmlns:w16="http://schemas.microsoft.com/office/word/2018/wordml" xmlns:w16du="http://schemas.microsoft.com/office/word/2023/wordml/word16du" xmlns:w16sdtdh="http://schemas.microsoft.com/office/word/2020/wordml/sdtdatahash" xmlns:w16sdtfl="http://schemas.microsoft.com/office/word/2024/wordml/sdtformatlock" xmlns:w16se="http://schemas.microsoft.com/office/word/2015/wordml/symex" xmlns:wpg="http://schemas.microsoft.com/office/word/2010/wordprocessingGroup" xmlns:wpi="http://schemas.microsoft.com/office/word/2010/wordprocessingInk" xmlns:wne="http://schemas.microsoft.com/office/word/2006/wordml" xmlns:wps="http://schemas.microsoft.com/office/word/2010/wordprocessingShape" mc:Ignorable="w14 w15 w16se w16cid w16 w16cex w16sdtdh w16sdtfl w16du wp14">
+<w:document xmlns:wpc="http://schemas.microsoft.com/office/word/2010/wordprocessingCanvas" xmlns:cx="http://schemas.microsoft.com/office/drawing/2014/chartex" xmlns:cx1="http://schemas.microsoft.com/office/drawing/2015/9/8/chartex" xmlns:cx2="http://schemas.microsoft.com/office/drawing/2015/10/21/chartex" xmlns:cx3="http://schemas.microsoft.com/office/drawing/2016/5/9/chartex" xmlns:cx4="http://schemas.microsoft.com/office/drawing/2016/5/10/chartex" xmlns:cx5="http://schemas.microsoft.com/office/drawing/2016/5/11/chartex" xmlns:cx6="http://schemas.microsoft.com/office/drawing/2016/5/12/chartex" xmlns:cx7="http://schemas.microsoft.com/office/drawing/2016/5/13/chartex" xmlns:cx8="http://schemas.microsoft.com/office/drawing/2016/5/14/chartex" xmlns:mc="http://schemas.openxmlformats.org/markup-compatibility/2006" xmlns:m="http://schemas.openxmlformats.org/officeDocument/2006/math" xmlns:aink="http://schemas.microsoft.com/office/drawing/2016/ink" xmlns:am3d="http://schemas.microsoft.com/office/drawing/2017/model3d" xmlns:oel="http://schemas.microsoft.com/office/2019/extlst" xmlns:r="http://schemas.openxmlformats.org/officeDocument/2006/relationships" xmlns:wp14="http://schemas.microsoft.com/office/word/2010/wordprocessingDrawing" xmlns:wp="http://schemas.openxmlformats.org/drawingml/2006/wordprocessingDrawing" xmlns:wpg="http://schemas.microsoft.com/office/word/2010/wordprocessingGroup" xmlns:wpi="http://schemas.microsoft.com/office/word/2010/wordprocessingInk" xmlns:wps="http://schemas.microsoft.com/office/word/2010/wordprocessingShape" xmlns:o="urn:schemas-microsoft-com:office:office" xmlns:v="urn:schemas-microsoft-com:vml" xmlns:w10="urn:schemas-microsoft-com:office:word" xmlns:w="http://schemas.openxmlformats.org/wordprocessingml/2006/main" xmlns:w14="http://schemas.microsoft.com/office/word/2010/wordml" xmlns:w15="http://schemas.microsoft.com/office/word/2012/wordml" xmlns:w16cex="http://schemas.microsoft.com/office/word/2018/wordml/cex" xmlns:w16cid="http://schemas.microsoft.com/office/word/2016/wordml/cid" xmlns:w16="http://schemas.microsoft.com/office/word/2018/wordml" xmlns:w16sdtdh="http://schemas.microsoft.com/office/word/2020/wordml/sdtdatahash" xmlns:w16sdtfl="http://schemas.microsoft.com/office/word/2024/wordml/sdtformatlock" xmlns:w16se="http://schemas.microsoft.com/office/word/2015/wordml/symex" xmlns:w16du="http://schemas.microsoft.com/office/word/2023/wordml/word16du" xmlns:wne="http://schemas.microsoft.com/office/word/2006/wordml" mc:Ignorable="w14 w15 w16se w16cid w16 w16cex w16sdtdh w16sdtfl w16du wp14">
   <w:body>
     <w:tbl>
       <w:tblPr>
@@ -785,7 +785,25 @@
           <w:color w:val="000000" w:themeColor="text1"/>
           <w:sz w:val="22"/>
         </w:rPr>
-        <w:t>Group 04 · B.Tech CSE-C, Semester VII · Department of Computer Engineering, Symbiosis Institute of Technology, Pune</w:t>
+        <w:t xml:space="preserve">Group 04 · </w:t>
+      </w:r>
+      <w:proofErr w:type="gramStart"/>
+      <w:r>
+        <w:rPr>
+          <w:i/>
+          <w:color w:val="000000" w:themeColor="text1"/>
+          <w:sz w:val="22"/>
+        </w:rPr>
+        <w:t>B.Tech</w:t>
+      </w:r>
+      <w:proofErr w:type="gramEnd"/>
+      <w:r>
+        <w:rPr>
+          <w:i/>
+          <w:color w:val="000000" w:themeColor="text1"/>
+          <w:sz w:val="22"/>
+        </w:rPr>
+        <w:t xml:space="preserve"> CSE-C, Semester VII · Department of Computer Engineering, Symbiosis Institute of Technology, Pune</w:t>
       </w:r>
     </w:p>
     <w:p>
@@ -870,7 +888,21 @@
         <w:rPr>
           <w:color w:val="000000" w:themeColor="text1"/>
         </w:rPr>
-        <w:t>AI systems have moved from answering questions to taking actions. Open protocols such as the Model Context Protocol (MCP) [2] and Agent2Agent (A2A) [3] let an agent call tools, read data and hand work to other agents. Each of these agents is a non-human identity, and such identities already dominate enterprise estates: machine identities outnumber human ones by about 82 to 1, and 42% of them hold privileged or sensitive access [4]. Stolen or abused credentials remain the most common way into a network, at 22% of initial access vectors in the 2025 Verizon report [5]. Agents make the problem sharper because they are created quickly, often share one API key, and delegate tasks to other agents without any record of who authorised what.</w:t>
+        <w:t xml:space="preserve">AI systems have moved from answering questions to taking actions. Open protocols such as the Model Context Protocol (MCP) [2] and Agent2Agent (A2A) [3] let an </w:t>
+      </w:r>
+      <w:proofErr w:type="gramStart"/>
+      <w:r>
+        <w:rPr>
+          <w:color w:val="000000" w:themeColor="text1"/>
+        </w:rPr>
+        <w:t>agent call tools</w:t>
+      </w:r>
+      <w:proofErr w:type="gramEnd"/>
+      <w:r>
+        <w:rPr>
+          <w:color w:val="000000" w:themeColor="text1"/>
+        </w:rPr>
+        <w:t>, read data and hand work to other agents. Each of these agents is a non-human identity, and such identities already dominate enterprise estates: machine identities outnumber human ones by about 82 to 1, and 42% of them hold privileged or sensitive access [4]. Stolen or abused credentials remain the most common way into a network, at 22% of initial access vectors in the 2025 Verizon report [5]. Agents make the problem sharper because they are created quickly, often share one API key, and delegate tasks to other agents without any record of who authorised what.</w:t>
       </w:r>
     </w:p>
     <w:p>
@@ -901,7 +933,21 @@
         <w:rPr>
           <w:color w:val="000000" w:themeColor="text1"/>
         </w:rPr>
-        <w:t xml:space="preserve">Anthropic's threat intelligence team detected the activity in mid-September 2025 and published its full report in November 2025 [1]. The campaign targeted about thirty entities, including large technology companies, financial institutions, chemical manufacturers and government agencies, and the investigation validated a handful of successful intrusions. Human operators chose the targets and approved a few escalation points, such as moving from reconnaissance to exploitation, using harvested credentials and deciding what data to take. The AI performed the remaining 80-90% of the work, at peak rates of several operations per second that no human team could match. To get past the model's safeguards, the operators posed as staff of a legitimate security firm doing defensive testing, and broke the work into small tasks that each </w:t>
+        <w:t xml:space="preserve">Anthropic's threat intelligence team detected the activity in mid-September 2025 and published its full report in November 2025 [1]. The campaign targeted about thirty entities, including large technology companies, financial institutions, chemical manufacturers and government agencies, and the investigation validated a handful of successful intrusions. Human operators chose the targets and approved a few escalation points, such as moving from reconnaissance to exploitation, using harvested credentials and deciding what data to take. The AI performed the remaining 80-90% of the work, at peak rates of several operations per second that no human team could match. To get past the model's safeguards, the operators posed as staff of a legitimate security firm doing defensive </w:t>
+      </w:r>
+      <w:proofErr w:type="gramStart"/>
+      <w:r>
+        <w:rPr>
+          <w:color w:val="000000" w:themeColor="text1"/>
+        </w:rPr>
+        <w:t>testing, and</w:t>
+      </w:r>
+      <w:proofErr w:type="gramEnd"/>
+      <w:r>
+        <w:rPr>
+          <w:color w:val="000000" w:themeColor="text1"/>
+        </w:rPr>
+        <w:t xml:space="preserve"> broke the work into small tasks that each </w:t>
       </w:r>
       <w:r>
         <w:rPr>
@@ -1066,7 +1112,23 @@
           <w:color w:val="000000" w:themeColor="text1"/>
           <w:sz w:val="24"/>
         </w:rPr>
-        <w:t>2.2 Non-human and agent identity</w:t>
+        <w:t xml:space="preserve">2.2 </w:t>
+      </w:r>
+      <w:proofErr w:type="gramStart"/>
+      <w:r>
+        <w:rPr>
+          <w:color w:val="000000" w:themeColor="text1"/>
+          <w:sz w:val="24"/>
+        </w:rPr>
+        <w:t>Non-human</w:t>
+      </w:r>
+      <w:proofErr w:type="gramEnd"/>
+      <w:r>
+        <w:rPr>
+          <w:color w:val="000000" w:themeColor="text1"/>
+          <w:sz w:val="24"/>
+        </w:rPr>
+        <w:t xml:space="preserve"> and agent identity</w:t>
       </w:r>
     </w:p>
     <w:p>
@@ -1081,7 +1143,21 @@
         <w:rPr>
           <w:color w:val="000000" w:themeColor="text1"/>
         </w:rPr>
-        <w:t>The OWASP Non-Human Identities Top 10 names risks such as improper offboarding, secret leakage, overprivileged identities and identity reuse [15]. The OWASP Top 10 for agentic applications adds agent-specific risks, including identity and privilege abuse and insecure inter-agent communication [16]. Workload identity frameworks such as SPIFFE give each service a verifiable identity [17], in line with the zero-trust principle that no request is trusted because of where it comes from [18]. Chan et al. propose three visibility measures for AI agents: agent identifiers, real-time monitoring and activity logs [19]. South et al. extend OAuth 2.0 and OpenID Connect so that a human can delegate limited, auditable authority to an agent [20].</w:t>
+        <w:t xml:space="preserve">The OWASP Non-Human Identities Top 10 names </w:t>
+      </w:r>
+      <w:proofErr w:type="gramStart"/>
+      <w:r>
+        <w:rPr>
+          <w:color w:val="000000" w:themeColor="text1"/>
+        </w:rPr>
+        <w:t>risks</w:t>
+      </w:r>
+      <w:proofErr w:type="gramEnd"/>
+      <w:r>
+        <w:rPr>
+          <w:color w:val="000000" w:themeColor="text1"/>
+        </w:rPr>
+        <w:t xml:space="preserve"> such as improper offboarding, secret leakage, overprivileged identities and identity reuse [15]. The OWASP Top 10 for agentic applications adds agent-specific risks, including identity and privilege abuse and insecure inter-agent communication [16]. Workload identity frameworks such as SPIFFE give each service a verifiable identity [17], in line with the zero-trust principle that no request is trusted because of where it comes from [18]. Chan et al. propose three visibility measures for AI agents: agent identifiers, real-time monitoring and activity logs [19]. South et al. extend OAuth 2.0 and OpenID Connect so that a human can delegate limited, auditable authority to an agent [20].</w:t>
       </w:r>
     </w:p>
     <w:p>
@@ -1113,7 +1189,21 @@
         <w:rPr>
           <w:color w:val="000000" w:themeColor="text1"/>
         </w:rPr>
-        <w:t>The principles of least privilege and complete mediation continue to form the basis, as do those of Saltzer and Schroeder [21]. Hardy's deputy is confused when a program uses its own authority for another's request [22] – just like an agent working on a human's behalf. Delegation is supported in OAuth 2.0 [23] and token exchange [24] and such claims are carried in JSON Web Tokens [25]. Resource indicators are used to attach a token to a service [26] and are also specified by the MCP authorization specification [2]. Macaroons showed that a bearer credential can be attenuated, so that each holder can only add restrictions [27]. An IETF draft is now proposing an on-behalf-of flow to be used for AI agents [28].</w:t>
+        <w:t>The principles of least privilege and complete mediation continue to form the basis, as do those of Saltzer and Schroeder [21]. Hardy's deputy is confused when a program uses its own authority for another's request [22] – just like an agent working on a human's behalf. Delegation is supported in OAuth 2.0 [23] and token exchange [24</w:t>
+      </w:r>
+      <w:proofErr w:type="gramStart"/>
+      <w:r>
+        <w:rPr>
+          <w:color w:val="000000" w:themeColor="text1"/>
+        </w:rPr>
+        <w:t>]</w:t>
+      </w:r>
+      <w:proofErr w:type="gramEnd"/>
+      <w:r>
+        <w:rPr>
+          <w:color w:val="000000" w:themeColor="text1"/>
+        </w:rPr>
+        <w:t xml:space="preserve"> and such claims are carried in JSON Web Tokens [25]. Resource indicators are used to attach a token to a service [26] and are also specified by the MCP authorization specification [2]. Macaroons showed that a bearer credential can be attenuated, so that each holder can only add restrictions [27]. An IETF draft is now proposing an on-behalf-of flow to be used for AI agents [28].</w:t>
       </w:r>
     </w:p>
     <w:p>
@@ -1158,7 +1248,21 @@
         <w:rPr>
           <w:color w:val="000000" w:themeColor="text1"/>
         </w:rPr>
-        <w:t xml:space="preserve"> [29]. Snort [30] and Bro (now Zeek [31]) have made network IDS practical, and NIST SP 800-94 outlines the deployment of detection and prevention systems [32]. It has been noted by Sommer and Paxson that anomaly detection has a problem with a high false-positive rate in real networks [33], which is relevant to agent traffic. There are attack stages provided by the kill chain [34] and MITRE ATT&amp;CK [35] that provide a common vocabulary. NIST SP 800-86 [36] and Casey [37] emphasize the integrity of evidence, while Crosby and Wallach [39] and Schneier and Kelsey [38] demonstrate how logs can be made tamper-evident. NIST SP 800-61r3 integrates incident response into overall risk management [40].</w:t>
+        <w:t xml:space="preserve"> [29]. Snort [30] and Bro (now Zeek [31]) have made network IDS practical, and NIST SP 800-94 outlines the deployment of detection and prevention systems [32]. It has been noted by Sommer and Paxson that anomaly detection has a problem with a high false-positive rate in real networks [33], which is relevant to agent traffic. There are attack stages provided by the kill chain [34] and MITRE ATT&amp;CK [35] that provide a common vocabulary. NIST SP 800-86 [36] and Casey [37] emphasize the integrity of evidence, while Crosby and Wallach [39] and Schneier and Kelsey [38] demonstrate how logs can be made </w:t>
+      </w:r>
+      <w:proofErr w:type="gramStart"/>
+      <w:r>
+        <w:rPr>
+          <w:color w:val="000000" w:themeColor="text1"/>
+        </w:rPr>
+        <w:t>tamper-evident</w:t>
+      </w:r>
+      <w:proofErr w:type="gramEnd"/>
+      <w:r>
+        <w:rPr>
+          <w:color w:val="000000" w:themeColor="text1"/>
+        </w:rPr>
+        <w:t>. NIST SP 800-61r3 integrates incident response into overall risk management [40].</w:t>
       </w:r>
     </w:p>
     <w:p>
@@ -1248,7 +1352,21 @@
         <w:rPr>
           <w:color w:val="000000" w:themeColor="text1"/>
         </w:rPr>
-        <w:t>We relied on the full report from Anthropic as our source [1] and industry reports for context [6, 7]. We have taken the six phases, the human approval gates, the tool categories and the operational tempo. Only public, summary level information was used and no part of the attack was reproduced.</w:t>
+        <w:t xml:space="preserve">We relied on the full report from Anthropic as our source [1] and industry reports for context [6, 7]. We have taken the six phases, the human approval gates, the tool categories and the operational tempo. Only public, summary level information was </w:t>
+      </w:r>
+      <w:proofErr w:type="gramStart"/>
+      <w:r>
+        <w:rPr>
+          <w:color w:val="000000" w:themeColor="text1"/>
+        </w:rPr>
+        <w:t>used</w:t>
+      </w:r>
+      <w:proofErr w:type="gramEnd"/>
+      <w:r>
+        <w:rPr>
+          <w:color w:val="000000" w:themeColor="text1"/>
+        </w:rPr>
+        <w:t xml:space="preserve"> and no part of the attack was reproduced.</w:t>
       </w:r>
     </w:p>
     <w:p>
@@ -2159,7 +2277,7 @@
         <w:rPr>
           <w:color w:val="000000" w:themeColor="text1"/>
         </w:rPr>
-        <w:t xml:space="preserve">The prototype is about 500 lines of Python 3 (standard library + matplotlib for the charts) code. Architecture and modules are shown in Fig. 1 and Table 2 respectively. The prototype is an abstract label – no code is run, and the name of the tool is only saved and </w:t>
+        <w:t xml:space="preserve">The prototype is about 500 lines of Python 3 (standard library + matplotlib for the charts) code. Architecture and modules are shown in Fig. 1 and Table 2 respectively. The prototype is an abstract label – no code is executed and the label name is only saved and </w:t>
       </w:r>
       <w:proofErr w:type="spellStart"/>
       <w:r>
@@ -2173,7 +2291,13 @@
         <w:rPr>
           <w:color w:val="000000" w:themeColor="text1"/>
         </w:rPr>
-        <w:t xml:space="preserve"> after </w:t>
+        <w:t xml:space="preserve"> </w:t>
+      </w:r>
+      <w:r>
+        <w:rPr>
+          <w:color w:val="000000" w:themeColor="text1"/>
+        </w:rPr>
+        <w:t xml:space="preserve">after </w:t>
       </w:r>
       <w:r>
         <w:rPr>
@@ -2453,7 +2577,39 @@
                 <w:color w:val="000000" w:themeColor="text1"/>
                 <w:sz w:val="21"/>
               </w:rPr>
-              <w:t>Append-only SHA-256 hash-chained log with verify() and timeline()</w:t>
+              <w:t xml:space="preserve">Append-only SHA-256 hash-chained log with </w:t>
+            </w:r>
+            <w:proofErr w:type="gramStart"/>
+            <w:r>
+              <w:rPr>
+                <w:color w:val="000000" w:themeColor="text1"/>
+                <w:sz w:val="21"/>
+              </w:rPr>
+              <w:t>verify(</w:t>
+            </w:r>
+            <w:proofErr w:type="gramEnd"/>
+            <w:r>
+              <w:rPr>
+                <w:color w:val="000000" w:themeColor="text1"/>
+                <w:sz w:val="21"/>
+              </w:rPr>
+              <w:t xml:space="preserve">) and </w:t>
+            </w:r>
+            <w:proofErr w:type="gramStart"/>
+            <w:r>
+              <w:rPr>
+                <w:color w:val="000000" w:themeColor="text1"/>
+                <w:sz w:val="21"/>
+              </w:rPr>
+              <w:t>timeline(</w:t>
+            </w:r>
+            <w:proofErr w:type="gramEnd"/>
+            <w:r>
+              <w:rPr>
+                <w:color w:val="000000" w:themeColor="text1"/>
+                <w:sz w:val="21"/>
+              </w:rPr>
+              <w:t>)</w:t>
             </w:r>
           </w:p>
         </w:tc>
@@ -2625,49 +2781,49 @@
         <w:rPr>
           <w:color w:val="000000" w:themeColor="text1"/>
         </w:rPr>
-        <w:t xml:space="preserve">A token is a Base64 encoded JSON claim set, signed with HMAC-SHA256 [41]. The claims are the token id, the grant id (shared by the whole delegation tree), the subject agent, the delegation chain starting with the human, the scopes, the resource prefixes, the issue and expiry times, the remaining delegation depth and the declared purpose. The delegate() function will reject any request whose scopes or resources are not a subset of the parent's, give the child an expiry as no earlier as the parent's, and decrease the depth by 1. Refusals are reported as </w:t>
-      </w:r>
-      <w:proofErr w:type="spellStart"/>
-      <w:r>
-        <w:rPr>
-          <w:color w:val="000000" w:themeColor="text1"/>
-        </w:rPr>
-        <w:t>scope_widening</w:t>
-      </w:r>
-      <w:proofErr w:type="spellEnd"/>
-      <w:r>
-        <w:rPr>
-          <w:color w:val="000000" w:themeColor="text1"/>
-        </w:rPr>
-        <w:t xml:space="preserve">, </w:t>
-      </w:r>
-      <w:proofErr w:type="spellStart"/>
-      <w:r>
-        <w:rPr>
-          <w:color w:val="000000" w:themeColor="text1"/>
-        </w:rPr>
-        <w:t>resource_widening</w:t>
-      </w:r>
-      <w:proofErr w:type="spellEnd"/>
-      <w:r>
-        <w:rPr>
-          <w:color w:val="000000" w:themeColor="text1"/>
-        </w:rPr>
-        <w:t xml:space="preserve"> or </w:t>
-      </w:r>
-      <w:proofErr w:type="spellStart"/>
-      <w:r>
-        <w:rPr>
-          <w:color w:val="000000" w:themeColor="text1"/>
-        </w:rPr>
-        <w:t>depth_exceeded</w:t>
-      </w:r>
-      <w:proofErr w:type="spellEnd"/>
-      <w:r>
-        <w:rPr>
-          <w:color w:val="000000" w:themeColor="text1"/>
-        </w:rPr>
-        <w:t xml:space="preserve"> and are logged.</w:t>
+        <w:t xml:space="preserve">A token is a Base64 encoded JSON claim set, signed with HMAC-SHA256 [41]. The claims are the token id, the grant id (common to the entire delegation tree), the subject agent, the delegation chain (beginning with the human), the scopes, the resource prefixes, the issue and expiry times, the remaining delegation depth and the declared purpose. The </w:t>
+      </w:r>
+      <w:proofErr w:type="gramStart"/>
+      <w:r>
+        <w:rPr>
+          <w:color w:val="000000" w:themeColor="text1"/>
+        </w:rPr>
+        <w:t>delegate(</w:t>
+      </w:r>
+      <w:proofErr w:type="gramEnd"/>
+      <w:r>
+        <w:rPr>
+          <w:color w:val="000000" w:themeColor="text1"/>
+        </w:rPr>
+        <w:t xml:space="preserve">) function will reject any request whose scopes or resources </w:t>
+      </w:r>
+      <w:proofErr w:type="gramStart"/>
+      <w:r>
+        <w:rPr>
+          <w:color w:val="000000" w:themeColor="text1"/>
+        </w:rPr>
+        <w:t>are not a subset of the parent's</w:t>
+      </w:r>
+      <w:proofErr w:type="gramEnd"/>
+      <w:r>
+        <w:rPr>
+          <w:color w:val="000000" w:themeColor="text1"/>
+        </w:rPr>
+        <w:t xml:space="preserve">, give the child an expiry as no earlier as the </w:t>
+      </w:r>
+      <w:proofErr w:type="gramStart"/>
+      <w:r>
+        <w:rPr>
+          <w:color w:val="000000" w:themeColor="text1"/>
+        </w:rPr>
+        <w:t>parent's</w:t>
+      </w:r>
+      <w:proofErr w:type="gramEnd"/>
+      <w:r>
+        <w:rPr>
+          <w:color w:val="000000" w:themeColor="text1"/>
+        </w:rPr>
+        <w:t>, and decrease the depth by 1. The scope is widened, the resources are widened or the depth is exceeded, these are reported and logged as refusals.</w:t>
       </w:r>
     </w:p>
     <w:p>
@@ -2695,7 +2851,7 @@
         <w:rPr>
           <w:color w:val="000000" w:themeColor="text1"/>
         </w:rPr>
-        <w:t>Each of these tools corresponds to one of the required scopes, and to one ATT&amp;CK tactic that it could be used for if it were misused. The gateway checks the signature, expiry, revocation, scope and resource prefix, and adds a record with the time, agent, chain, grant, tool, tactic, resource, decision and reason. Each record also contains a hash of the previous record and the current record, using the SHA-256 hash function; thus, if the hash of any previous record is changed, then all subsequent records are invalid.</w:t>
+        <w:t>These tools are associated with one of the required scopes, and one ATT&amp;CK tactic that it might be misused for. The gateway verifies the signature, expiration, revocation, scope and resource prefix, and creates a record of the time, agent, chain, grant, tool, tactic, resource, decision and reason. Each record also contains a hash of the previous record and the current record, using the SHA-256 hash function; thus, if the hash of any previous record is changed, then all subsequent records are invalid.</w:t>
       </w:r>
     </w:p>
     <w:p>
@@ -2717,7 +2873,27 @@
         <w:rPr>
           <w:color w:val="000000" w:themeColor="text1"/>
         </w:rPr>
-        <w:t xml:space="preserve"> Three simple rules run over the audit stream. R1 (tempo) fires when one agent makes more than 20 calls in 10 seconds, a rate no human operator sustains. R2 (probing) fires when one agent is denied three times within 60 seconds. R3 (multi-tactic chain) fires when one delegation grant touches three or more sensitive tactics within 30 minutes; it is keyed on the grant, so tasks split across sub-agents are correlated again. Each rule and key has a 15-minute cooldown.</w:t>
+        <w:t xml:space="preserve"> </w:t>
+      </w:r>
+      <w:r>
+        <w:rPr>
+          <w:color w:val="000000" w:themeColor="text1"/>
+        </w:rPr>
+        <w:t xml:space="preserve">The following rules are applied to the audit stream: R1 (tempo) will fire when one agent is making over 20 calls in 10 seconds, a rate that no human operator can keep up with. R2 (probing) fires when agent is denied 3 times within 60 seconds. R3 (multi-tactic chain) fires when a delegation grant touches three or more sensitive tactics in 30 minutes or less, keyed to the grant, so tasks that are split across sub-agents are correlated again. Rules and keys have a </w:t>
+      </w:r>
+      <w:proofErr w:type="gramStart"/>
+      <w:r>
+        <w:rPr>
+          <w:color w:val="000000" w:themeColor="text1"/>
+        </w:rPr>
+        <w:t>15 minute</w:t>
+      </w:r>
+      <w:proofErr w:type="gramEnd"/>
+      <w:r>
+        <w:rPr>
+          <w:color w:val="000000" w:themeColor="text1"/>
+        </w:rPr>
+        <w:t xml:space="preserve"> cool down.</w:t>
       </w:r>
     </w:p>
     <w:p>
@@ -2733,20 +2909,20 @@
           <w:b/>
           <w:color w:val="000000" w:themeColor="text1"/>
         </w:rPr>
+        <w:lastRenderedPageBreak/>
         <w:t>Workload.</w:t>
       </w:r>
       <w:r>
         <w:rPr>
           <w:color w:val="000000" w:themeColor="text1"/>
         </w:rPr>
-        <w:t xml:space="preserve"> Four benign agents run for three simulated hours: a CI agent with bursty test runs, a documentation agent, an operations agent that inventories hosts and queries a reporting </w:t>
-      </w:r>
-      <w:r>
-        <w:rPr>
-          <w:color w:val="000000" w:themeColor="text1"/>
-        </w:rPr>
-        <w:lastRenderedPageBreak/>
-        <w:t>database, and a backup agent that exports production tables to a backup vault. The backup job was included on purpose, because it looks like collection followed by exfiltration. The misuse case follows only the public shape of GTG-1002. An external contractor identity owns an orchestrator holding an engagement grant for inventory and scanning on staging systems only, with a two-hour lifetime and a delegation depth of one. The orchestrator tries to hand five sub-agents wider tasks across discovery, credential access, lateral movement, collection and exfiltration. Phases are separated by human approval gaps of 2-20 minutes, and the tempo varies from 0.3 to 4 calls per second between runs.</w:t>
+        <w:t xml:space="preserve"> </w:t>
+      </w:r>
+      <w:r>
+        <w:rPr>
+          <w:color w:val="000000" w:themeColor="text1"/>
+        </w:rPr>
+        <w:t>Four benign agents are running for three time periods, including a CI agent that has bursty test runs, a documentation agent, an operations agent that inventories hosts and queries a reporting database, and a backup agent that exports production tables to a backup vault. The backup job was added intentionally since it appears to be a collection followed by an exfiltration. The public shape of GTG-1002 only is followed in the misuse case. An external contractor identity owns an orchestrator that has an engagement grant for inventory and scanning on staging systems only, and with a lifetime of 2 hours and a delegation depth of 1. The orchestrator attempts to pass off five sub-agents in discovery, credential access, lateral movement, collection and exfiltration. There are human-approved gaps of 2-20 minutes between phases, and 0.3 - 4 calls per second between runs.</w:t>
       </w:r>
     </w:p>
     <w:p>
@@ -2777,7 +2953,7 @@
         <w:rPr>
           <w:color w:val="000000" w:themeColor="text1"/>
         </w:rPr>
-        <w:t>Table 3 summarises the 50-run comparison. Fig. 2 breaks the allowed misuse calls down by tactic, Fig. 3 compares the main outcomes, and Fig. 4 shows the forensic timeline rebuilt from the audit log for one run.</w:t>
+        <w:t>The 50-run comparison is tabulated below (Table 3). Fig. 2 is a breakdown of the allowed misuse calls by tactic, Fig. 3 is a comparison of the primary outcomes, and Fig. 4 is a forensic timeline built from the audit log for one run.</w:t>
       </w:r>
     </w:p>
     <w:p>
@@ -3614,7 +3790,34 @@
         <w:rPr>
           <w:color w:val="000000" w:themeColor="text1"/>
         </w:rPr>
-        <w:t xml:space="preserve"> Scoped delegation blocked 77% of misuse calls. Every attempt to hand a sub-agent credential access, remote execution, database export or outbound transfer was refused at delegation time, and the refusal itself became evidence. The calls that still succeeded (about 31 per run) were discovery calls on staging hosts that the engagement had actually authorised. Scoping therefore does not stop misuse of authority that was legitimately granted, so detection is still needed. Production and external resources reached by misuse fell from 24.9 per run to zero, and no benign call was denied in either configuration.</w:t>
+        <w:t xml:space="preserve"> </w:t>
+      </w:r>
+      <w:r>
+        <w:rPr>
+          <w:color w:val="000000" w:themeColor="text1"/>
+        </w:rPr>
+        <w:t xml:space="preserve">77% of misuse calls were blocked with scoped delegation. All attempts to give access to a sub-agent, to execute remotely, to export a database, or to transfer a database outbound were denied at delegation time, and the denial was recorded as evidence. Of the calls that did get through (around 31 per run), they were discovery calls on staging hosts that the engagement had permission for. Scoping does not prevent misuse of authority that </w:t>
+      </w:r>
+      <w:proofErr w:type="gramStart"/>
+      <w:r>
+        <w:rPr>
+          <w:color w:val="000000" w:themeColor="text1"/>
+        </w:rPr>
+        <w:t xml:space="preserve">is </w:t>
+      </w:r>
+      <w:r>
+        <w:rPr>
+          <w:color w:val="000000" w:themeColor="text1"/>
+        </w:rPr>
+        <w:lastRenderedPageBreak/>
+        <w:t>properly granted,</w:t>
+      </w:r>
+      <w:proofErr w:type="gramEnd"/>
+      <w:r>
+        <w:rPr>
+          <w:color w:val="000000" w:themeColor="text1"/>
+        </w:rPr>
+        <w:t xml:space="preserve"> therefore detection is required. Production and external resources accessed through misuse dropped from 24.9 per run to 0 and no benign call was denied in either configuration.</w:t>
       </w:r>
     </w:p>
     <w:p>
@@ -3631,7 +3834,6 @@
           <w:noProof/>
           <w:color w:val="000000" w:themeColor="text1"/>
         </w:rPr>
-        <w:lastRenderedPageBreak/>
         <w:drawing>
           <wp:inline distT="0" distB="0" distL="0" distR="0" wp14:anchorId="3787E3E3" wp14:editId="733E5BBF">
             <wp:extent cx="5669280" cy="1652859"/>
@@ -3705,7 +3907,41 @@
         <w:rPr>
           <w:color w:val="000000" w:themeColor="text1"/>
         </w:rPr>
-        <w:t xml:space="preserve"> Both configurations detected the misuse in every run, and the baseline was fast too (median 5.3 s compared with 2.7 s), because high tempo is visible even on a shared key. The difference lies in what an alert means. Baseline alerts name only the shared key, so a responder can contain the attack only by revoking that key and stopping all four legitimate agents along with it. Mixing several agents' traffic on one key also produced 2.34 false alerts per run: the inventory sweeps and the backup job together looked like a multi-tactic chain. With per-agent identities there were no false alerts, and all 8.5 true alerts per run named the agent, its orchestrator and the human owner, so a single grant could be revoked without affecting anything else. The probing rule (R2), which only works when denials are attributed to a specific agent, raised the first alert in most runs.</w:t>
+        <w:t xml:space="preserve"> </w:t>
+      </w:r>
+      <w:r>
+        <w:rPr>
+          <w:color w:val="000000" w:themeColor="text1"/>
+        </w:rPr>
+        <w:t xml:space="preserve">Both configurations identified the misuse in all </w:t>
+      </w:r>
+      <w:proofErr w:type="gramStart"/>
+      <w:r>
+        <w:rPr>
+          <w:color w:val="000000" w:themeColor="text1"/>
+        </w:rPr>
+        <w:t>runs</w:t>
+      </w:r>
+      <w:proofErr w:type="gramEnd"/>
+      <w:r>
+        <w:rPr>
+          <w:color w:val="000000" w:themeColor="text1"/>
+        </w:rPr>
+        <w:t xml:space="preserve"> and the baseline was also fast (median 5.3 s vs. 2.7 s) since high tempo is detectable even on a shared key. The distinction is in the meaning of an alert. The only information in baseline alerts is the shared key; if the attack is allowed to continue, only a responder who knows and has revoked that key can contain the attack, as well as the four legitimate agents. A combination of multiple agents' traffic on a single key also triggered 2.34 false alerts per run: the inventory sweeps and the backup job seemed like a multi-tactic chain. There were no false alerts with per-agent identities, and all 8.5 true alerts per run were named for the agent, its orchestrator and the human owner, so a single grant could be revoked without impacting anything else. Most runs had the first alert </w:t>
+      </w:r>
+      <w:proofErr w:type="gramStart"/>
+      <w:r>
+        <w:rPr>
+          <w:color w:val="000000" w:themeColor="text1"/>
+        </w:rPr>
+        <w:t>as a result of</w:t>
+      </w:r>
+      <w:proofErr w:type="gramEnd"/>
+      <w:r>
+        <w:rPr>
+          <w:color w:val="000000" w:themeColor="text1"/>
+        </w:rPr>
+        <w:t xml:space="preserve"> the probing rule (R2), which can only be applied if denials are attributed to a particular agent.</w:t>
       </w:r>
     </w:p>
     <w:p>
@@ -3795,7 +4031,13 @@
         <w:rPr>
           <w:color w:val="000000" w:themeColor="text1"/>
         </w:rPr>
-        <w:t xml:space="preserve"> Every misuse record was attributable to the contractor identity (100% compared with 0%), so the timeline in Fig. 4 can be read directly as "who, on whose behalf, did what, when". In the tamper test, changing one denied record to allowed in a 634-record log was detected at exactly record 100. Verifying a token added about 6.4 µs per call (14.7 µs compared with 8.3 µs for the shared key, in pure Python), which is negligible next to the latency of a model call.</w:t>
+        <w:t xml:space="preserve"> </w:t>
+      </w:r>
+      <w:r>
+        <w:rPr>
+          <w:color w:val="000000" w:themeColor="text1"/>
+        </w:rPr>
+        <w:t>All misuse records had a contractor identity (100% versus 0%), which is why the timeline in Fig. 4 can be interpreted directly as "who, on whose behalf, did what, when". The tamper test is a test where a change from one denied to one allowed record in a log of 634 records was detected at record 100. Adding a token increased the latency per call by about 6.4 µs (14.7 µs vs. 8.3 µs for adding the shared key), which is very small compared to the latency of a model call.</w:t>
       </w:r>
     </w:p>
     <w:p>
@@ -3811,20 +4053,62 @@
           <w:b/>
           <w:color w:val="000000" w:themeColor="text1"/>
         </w:rPr>
+        <w:lastRenderedPageBreak/>
         <w:t>What this means for GTG-1002.</w:t>
       </w:r>
       <w:r>
         <w:rPr>
           <w:color w:val="000000" w:themeColor="text1"/>
         </w:rPr>
-        <w:t xml:space="preserve"> In the real campaign the agents ran on the attackers' own infrastructure, so a victim cannot force the attacker to use scoped tokens. The controls therefore apply in three places. AI and tool platforms can require a verified, accountable identity and an explicit, scoped grant before an agent is used for security testing, which turns a role-play claim </w:t>
-      </w:r>
-      <w:r>
-        <w:rPr>
-          <w:color w:val="000000" w:themeColor="text1"/>
-        </w:rPr>
-        <w:lastRenderedPageBreak/>
-        <w:t>into a decision that a named person is responsible for. Organisations running their own agents can stop those agents from being hijacked or over-trusted. Target organisations can issue short-lived, narrowly scoped credentials to machines, so that credentials harvested during an intrusion are worth far less. In all three cases the same identity data that limits damage also makes detection more precise and attribution possible.</w:t>
+        <w:t xml:space="preserve"> </w:t>
+      </w:r>
+      <w:r>
+        <w:rPr>
+          <w:color w:val="000000" w:themeColor="text1"/>
+        </w:rPr>
+        <w:t xml:space="preserve">The agents that the attacker would have in the real campaign would be running on the attacker's own infrastructure, and a victim cannot force the attacker to use scoped tokens. The controls are thus present in three locations. A role-play claim becomes a decision of a named person when an AI and tool platform requires a verified, accountable identity and an explicit, scoped grant before an agent can be used for security testing. </w:t>
+      </w:r>
+      <w:proofErr w:type="spellStart"/>
+      <w:r>
+        <w:rPr>
+          <w:color w:val="000000" w:themeColor="text1"/>
+        </w:rPr>
+        <w:t>Organisations</w:t>
+      </w:r>
+      <w:proofErr w:type="spellEnd"/>
+      <w:r>
+        <w:rPr>
+          <w:color w:val="000000" w:themeColor="text1"/>
+        </w:rPr>
+        <w:t xml:space="preserve"> with their own agents can prevent their agents from being hijacked or over trusted. Target </w:t>
+      </w:r>
+      <w:proofErr w:type="spellStart"/>
+      <w:r>
+        <w:rPr>
+          <w:color w:val="000000" w:themeColor="text1"/>
+        </w:rPr>
+        <w:t>organisations</w:t>
+      </w:r>
+      <w:proofErr w:type="spellEnd"/>
+      <w:r>
+        <w:rPr>
+          <w:color w:val="000000" w:themeColor="text1"/>
+        </w:rPr>
+        <w:t xml:space="preserve"> can create short-lived, </w:t>
+      </w:r>
+      <w:proofErr w:type="gramStart"/>
+      <w:r>
+        <w:rPr>
+          <w:color w:val="000000" w:themeColor="text1"/>
+        </w:rPr>
+        <w:t>narrowly-scoped</w:t>
+      </w:r>
+      <w:proofErr w:type="gramEnd"/>
+      <w:r>
+        <w:rPr>
+          <w:color w:val="000000" w:themeColor="text1"/>
+        </w:rPr>
+        <w:t xml:space="preserve"> credentials for machines, making credentials stolen during an intrusion worth far less. In all three instances, the same information used to restrict damage can also be used to more accurately detect damage and attribute it.</w:t>
       </w:r>
     </w:p>
     <w:p>
@@ -3846,7 +4130,27 @@
         <w:rPr>
           <w:color w:val="000000" w:themeColor="text1"/>
         </w:rPr>
-        <w:t xml:space="preserve"> The data is synthetic and the thresholds were set by hand, so the absolute numbers should not be generalised; real deployments would need tuning against real logs, given the known difficulty of anomaly detection [33]. The prototype uses a single signing key and does not cover delegation across organisations, token theft from memory, or an attacker who stays slowly inside a legitimate scope.</w:t>
+        <w:t xml:space="preserve"> </w:t>
+      </w:r>
+      <w:r>
+        <w:rPr>
+          <w:color w:val="000000" w:themeColor="text1"/>
+        </w:rPr>
+        <w:t xml:space="preserve">The numbers are synthetic and the thresholds were manually selected, so the actual numbers should not be generalized, and the thresholds would have to be tuned to real logs, which is known to be hard in the context of anomaly detection [33]. The prototype does not support delegation across </w:t>
+      </w:r>
+      <w:proofErr w:type="spellStart"/>
+      <w:r>
+        <w:rPr>
+          <w:color w:val="000000" w:themeColor="text1"/>
+        </w:rPr>
+        <w:t>organisations</w:t>
+      </w:r>
+      <w:proofErr w:type="spellEnd"/>
+      <w:r>
+        <w:rPr>
+          <w:color w:val="000000" w:themeColor="text1"/>
+        </w:rPr>
+        <w:t>, slow ingression to a valid scope by an attacker or token theft from memory, nor does it support delegation of signing keys.</w:t>
       </w:r>
     </w:p>
     <w:p>
@@ -3877,7 +4181,21 @@
         <w:rPr>
           <w:color w:val="000000" w:themeColor="text1"/>
         </w:rPr>
-        <w:t>GTG-1002 showed that an AI agent can carry out most of an intrusion using ordinary tools, with humans stepping in only at a few decision points. The most important lesson for defenders is not about any single exploit; it is that the agents acted with authority that nobody had scoped and nobody could trace. This report mapped each phase of the campaign to the identity failure it relied on and tested three controls: a non-human identity per agent, delegation that can only narrow, and identity-aware detection backed by a tamper-evident log. In our prototype these controls blocked 77% of misuse calls, reduced the exposed production surface to zero, removed false alerts and attributed every alert to an accountable human, at negligible cost. Future work includes testing on real agent logs, learning thresholds per agent, cross-organisation delegation over A2A, and platform-level verification of agent identity before security-sensitive use.</w:t>
+        <w:t>GTG-1002 demonstrated that the majority of an intrusion could be performed by an AI agent with the involvement of humans at a small number of decision points. The most critical thing to learn for defenders is not about any one exploit; it's about the agents' authority was exercised without anyone being able to scope it, without anyone being able to trace it. Each phase of the campaign was mapped to the identity failure it depended on and three controls were tested: a non-human identity per agent, delegation that can only narrow, and identity-aware detection with a tamper evident log. In our prototype these controls prevented 77% of misuse calls, eliminated any exposed production surface, and eliminated false alarms and assigned all alarms to an accountable human at negligible cost. Future work involves testing on real agent logs, learning thresholds per agent, cross-</w:t>
+      </w:r>
+      <w:proofErr w:type="spellStart"/>
+      <w:r>
+        <w:rPr>
+          <w:color w:val="000000" w:themeColor="text1"/>
+        </w:rPr>
+        <w:t>organisation</w:t>
+      </w:r>
+      <w:proofErr w:type="spellEnd"/>
+      <w:r>
+        <w:rPr>
+          <w:color w:val="000000" w:themeColor="text1"/>
+        </w:rPr>
+        <w:t xml:space="preserve"> delegation over A2A and platform-level verification of agent identity prior to security-sensitive use.</w:t>
       </w:r>
     </w:p>
     <w:p>
@@ -4128,6 +4446,7 @@
           <w:color w:val="000000" w:themeColor="text1"/>
           <w:sz w:val="22"/>
         </w:rPr>
+        <w:lastRenderedPageBreak/>
         <w:t>[9]</w:t>
       </w:r>
       <w:r>
@@ -4190,15 +4509,7 @@
           <w:sz w:val="22"/>
         </w:rPr>
         <w:tab/>
-        <w:t xml:space="preserve">K. Greshake, S. Abdelnabi, S. Mishra, C. Endres, T. Holz, and M. Fritz, "Not what you've signed up for: Compromising real-world LLM-integrated applications with indirect prompt </w:t>
-      </w:r>
-      <w:r>
-        <w:rPr>
-          <w:color w:val="000000" w:themeColor="text1"/>
-          <w:sz w:val="22"/>
-        </w:rPr>
-        <w:lastRenderedPageBreak/>
-        <w:t>injection," in Proc. 16th ACM Workshop on Artificial Intelligence and Security (AISec), 2023, pp. 79-90.</w:t>
+        <w:t>K. Greshake, S. Abdelnabi, S. Mishra, C. Endres, T. Holz, and M. Fritz, "Not what you've signed up for: Compromising real-world LLM-integrated applications with indirect prompt injection," in Proc. 16th ACM Workshop on Artificial Intelligence and Security (AISec), 2023, pp. 79-90.</w:t>
       </w:r>
     </w:p>
     <w:p>
@@ -4757,6 +5068,7 @@
           <w:color w:val="000000" w:themeColor="text1"/>
           <w:sz w:val="22"/>
         </w:rPr>
+        <w:lastRenderedPageBreak/>
         <w:t>[32]</w:t>
       </w:r>
       <w:r>
@@ -4811,7 +5123,6 @@
           <w:color w:val="000000" w:themeColor="text1"/>
           <w:sz w:val="22"/>
         </w:rPr>
-        <w:lastRenderedPageBreak/>
         <w:t>[34]</w:t>
       </w:r>
       <w:r>
@@ -5009,7 +5320,23 @@
           <w:sz w:val="22"/>
         </w:rPr>
         <w:tab/>
-        <w:t>H. Krawczyk, M. Bellare, and R. Canetti, "HMAC: Keyed-hashing for message authentication," IETF RFC 2104, Feb. 1997.</w:t>
+        <w:t xml:space="preserve">H. Krawczyk, M. Bellare, and R. Canetti, "HMAC: </w:t>
+      </w:r>
+      <w:proofErr w:type="gramStart"/>
+      <w:r>
+        <w:rPr>
+          <w:color w:val="000000" w:themeColor="text1"/>
+          <w:sz w:val="22"/>
+        </w:rPr>
+        <w:t>Keyed-hashing</w:t>
+      </w:r>
+      <w:proofErr w:type="gramEnd"/>
+      <w:r>
+        <w:rPr>
+          <w:color w:val="000000" w:themeColor="text1"/>
+          <w:sz w:val="22"/>
+        </w:rPr>
+        <w:t xml:space="preserve"> for message authentication," IETF RFC 2104, Feb. 1997.</w:t>
       </w:r>
     </w:p>
     <w:sectPr>
@@ -5026,7 +5353,7 @@
 </file>
 
 <file path=word/endnotes.xml><?xml version="1.0" encoding="utf-8"?>
-<w:endnotes xmlns:wpc="http://schemas.microsoft.com/office/word/2010/wordprocessingCanvas" xmlns:cx="http://schemas.microsoft.com/office/drawing/2014/chartex" xmlns:cx1="http://schemas.microsoft.com/office/drawing/2015/9/8/chartex" xmlns:cx2="http://schemas.microsoft.com/office/drawing/2015/10/21/chartex" xmlns:cx3="http://schemas.microsoft.com/office/drawing/2016/5/9/chartex" xmlns:cx4="http://schemas.microsoft.com/office/drawing/2016/5/10/chartex" xmlns:cx5="http://schemas.microsoft.com/office/drawing/2016/5/11/chartex" xmlns:cx6="http://schemas.microsoft.com/office/drawing/2016/5/12/chartex" xmlns:cx7="http://schemas.microsoft.com/office/drawing/2016/5/13/chartex" xmlns:cx8="http://schemas.microsoft.com/office/drawing/2016/5/14/chartex" xmlns:mc="http://schemas.openxmlformats.org/markup-compatibility/2006" xmlns:aink="http://schemas.microsoft.com/office/drawing/2016/ink" xmlns:am3d="http://schemas.microsoft.com/office/drawing/2017/model3d" xmlns:o="urn:schemas-microsoft-com:office:office" xmlns:oel="http://schemas.microsoft.com/office/2019/extlst" xmlns:r="http://schemas.openxmlformats.org/officeDocument/2006/relationships" xmlns:m="http://schemas.openxmlformats.org/officeDocument/2006/math" xmlns:v="urn:schemas-microsoft-com:vml" xmlns:wp14="http://schemas.microsoft.com/office/word/2010/wordprocessingDrawing" xmlns:wp="http://schemas.openxmlformats.org/drawingml/2006/wordprocessingDrawing" xmlns:w10="urn:schemas-microsoft-com:office:word" xmlns:w="http://schemas.openxmlformats.org/wordprocessingml/2006/main" xmlns:w14="http://schemas.microsoft.com/office/word/2010/wordml" xmlns:w15="http://schemas.microsoft.com/office/word/2012/wordml" xmlns:w16cex="http://schemas.microsoft.com/office/word/2018/wordml/cex" xmlns:w16cid="http://schemas.microsoft.com/office/word/2016/wordml/cid" xmlns:w16="http://schemas.microsoft.com/office/word/2018/wordml" xmlns:w16du="http://schemas.microsoft.com/office/word/2023/wordml/word16du" xmlns:w16sdtdh="http://schemas.microsoft.com/office/word/2020/wordml/sdtdatahash" xmlns:w16sdtfl="http://schemas.microsoft.com/office/word/2024/wordml/sdtformatlock" xmlns:w16se="http://schemas.microsoft.com/office/word/2015/wordml/symex" xmlns:wpg="http://schemas.microsoft.com/office/word/2010/wordprocessingGroup" xmlns:wpi="http://schemas.microsoft.com/office/word/2010/wordprocessingInk" xmlns:wne="http://schemas.microsoft.com/office/word/2006/wordml" xmlns:wps="http://schemas.microsoft.com/office/word/2010/wordprocessingShape" mc:Ignorable="w14 w15 w16se w16cid w16 w16cex w16sdtdh w16sdtfl w16du wp14">
+<w:endnotes xmlns:wpc="http://schemas.microsoft.com/office/word/2010/wordprocessingCanvas" xmlns:cx="http://schemas.microsoft.com/office/drawing/2014/chartex" xmlns:cx1="http://schemas.microsoft.com/office/drawing/2015/9/8/chartex" xmlns:cx2="http://schemas.microsoft.com/office/drawing/2015/10/21/chartex" xmlns:cx3="http://schemas.microsoft.com/office/drawing/2016/5/9/chartex" xmlns:cx4="http://schemas.microsoft.com/office/drawing/2016/5/10/chartex" xmlns:cx5="http://schemas.microsoft.com/office/drawing/2016/5/11/chartex" xmlns:cx6="http://schemas.microsoft.com/office/drawing/2016/5/12/chartex" xmlns:cx7="http://schemas.microsoft.com/office/drawing/2016/5/13/chartex" xmlns:cx8="http://schemas.microsoft.com/office/drawing/2016/5/14/chartex" xmlns:mc="http://schemas.openxmlformats.org/markup-compatibility/2006" xmlns:m="http://schemas.openxmlformats.org/officeDocument/2006/math" xmlns:aink="http://schemas.microsoft.com/office/drawing/2016/ink" xmlns:am3d="http://schemas.microsoft.com/office/drawing/2017/model3d" xmlns:oel="http://schemas.microsoft.com/office/2019/extlst" xmlns:r="http://schemas.openxmlformats.org/officeDocument/2006/relationships" xmlns:wp14="http://schemas.microsoft.com/office/word/2010/wordprocessingDrawing" xmlns:wp="http://schemas.openxmlformats.org/drawingml/2006/wordprocessingDrawing" xmlns:wpg="http://schemas.microsoft.com/office/word/2010/wordprocessingGroup" xmlns:wpi="http://schemas.microsoft.com/office/word/2010/wordprocessingInk" xmlns:wps="http://schemas.microsoft.com/office/word/2010/wordprocessingShape" xmlns:o="urn:schemas-microsoft-com:office:office" xmlns:v="urn:schemas-microsoft-com:vml" xmlns:w10="urn:schemas-microsoft-com:office:word" xmlns:w="http://schemas.openxmlformats.org/wordprocessingml/2006/main" xmlns:w14="http://schemas.microsoft.com/office/word/2010/wordml" xmlns:w15="http://schemas.microsoft.com/office/word/2012/wordml" xmlns:w16cex="http://schemas.microsoft.com/office/word/2018/wordml/cex" xmlns:w16cid="http://schemas.microsoft.com/office/word/2016/wordml/cid" xmlns:w16="http://schemas.microsoft.com/office/word/2018/wordml" xmlns:w16sdtdh="http://schemas.microsoft.com/office/word/2020/wordml/sdtdatahash" xmlns:w16sdtfl="http://schemas.microsoft.com/office/word/2024/wordml/sdtformatlock" xmlns:w16se="http://schemas.microsoft.com/office/word/2015/wordml/symex" xmlns:w16du="http://schemas.microsoft.com/office/word/2023/wordml/word16du" xmlns:wne="http://schemas.microsoft.com/office/word/2006/wordml" mc:Ignorable="w14 w15 w16se w16cid w16 w16cex w16sdtdh w16sdtfl w16du wp14">
   <w:endnote w:type="separator" w:id="-1">
     <w:p>
       <w:r>
@@ -5045,7 +5372,7 @@
 </file>
 
 <file path=word/footer1.xml><?xml version="1.0" encoding="utf-8"?>
-<w:ftr xmlns:wpc="http://schemas.microsoft.com/office/word/2010/wordprocessingCanvas" xmlns:cx="http://schemas.microsoft.com/office/drawing/2014/chartex" xmlns:cx1="http://schemas.microsoft.com/office/drawing/2015/9/8/chartex" xmlns:cx2="http://schemas.microsoft.com/office/drawing/2015/10/21/chartex" xmlns:cx3="http://schemas.microsoft.com/office/drawing/2016/5/9/chartex" xmlns:cx4="http://schemas.microsoft.com/office/drawing/2016/5/10/chartex" xmlns:cx5="http://schemas.microsoft.com/office/drawing/2016/5/11/chartex" xmlns:cx6="http://schemas.microsoft.com/office/drawing/2016/5/12/chartex" xmlns:cx7="http://schemas.microsoft.com/office/drawing/2016/5/13/chartex" xmlns:cx8="http://schemas.microsoft.com/office/drawing/2016/5/14/chartex" xmlns:mc="http://schemas.openxmlformats.org/markup-compatibility/2006" xmlns:aink="http://schemas.microsoft.com/office/drawing/2016/ink" xmlns:am3d="http://schemas.microsoft.com/office/drawing/2017/model3d" xmlns:o="urn:schemas-microsoft-com:office:office" xmlns:oel="http://schemas.microsoft.com/office/2019/extlst" xmlns:r="http://schemas.openxmlformats.org/officeDocument/2006/relationships" xmlns:m="http://schemas.openxmlformats.org/officeDocument/2006/math" xmlns:v="urn:schemas-microsoft-com:vml" xmlns:wp14="http://schemas.microsoft.com/office/word/2010/wordprocessingDrawing" xmlns:wp="http://schemas.openxmlformats.org/drawingml/2006/wordprocessingDrawing" xmlns:w10="urn:schemas-microsoft-com:office:word" xmlns:w="http://schemas.openxmlformats.org/wordprocessingml/2006/main" xmlns:w14="http://schemas.microsoft.com/office/word/2010/wordml" xmlns:w15="http://schemas.microsoft.com/office/word/2012/wordml" xmlns:w16cex="http://schemas.microsoft.com/office/word/2018/wordml/cex" xmlns:w16cid="http://schemas.microsoft.com/office/word/2016/wordml/cid" xmlns:w16="http://schemas.microsoft.com/office/word/2018/wordml" xmlns:w16du="http://schemas.microsoft.com/office/word/2023/wordml/word16du" xmlns:w16sdtdh="http://schemas.microsoft.com/office/word/2020/wordml/sdtdatahash" xmlns:w16sdtfl="http://schemas.microsoft.com/office/word/2024/wordml/sdtformatlock" xmlns:w16se="http://schemas.microsoft.com/office/word/2015/wordml/symex" xmlns:wpg="http://schemas.microsoft.com/office/word/2010/wordprocessingGroup" xmlns:wpi="http://schemas.microsoft.com/office/word/2010/wordprocessingInk" xmlns:wne="http://schemas.microsoft.com/office/word/2006/wordml" xmlns:wps="http://schemas.microsoft.com/office/word/2010/wordprocessingShape" mc:Ignorable="w14 w15 w16se w16cid w16 w16cex w16sdtdh w16sdtfl w16du wp14">
+<w:ftr xmlns:wpc="http://schemas.microsoft.com/office/word/2010/wordprocessingCanvas" xmlns:cx="http://schemas.microsoft.com/office/drawing/2014/chartex" xmlns:cx1="http://schemas.microsoft.com/office/drawing/2015/9/8/chartex" xmlns:cx2="http://schemas.microsoft.com/office/drawing/2015/10/21/chartex" xmlns:cx3="http://schemas.microsoft.com/office/drawing/2016/5/9/chartex" xmlns:cx4="http://schemas.microsoft.com/office/drawing/2016/5/10/chartex" xmlns:cx5="http://schemas.microsoft.com/office/drawing/2016/5/11/chartex" xmlns:cx6="http://schemas.microsoft.com/office/drawing/2016/5/12/chartex" xmlns:cx7="http://schemas.microsoft.com/office/drawing/2016/5/13/chartex" xmlns:cx8="http://schemas.microsoft.com/office/drawing/2016/5/14/chartex" xmlns:mc="http://schemas.openxmlformats.org/markup-compatibility/2006" xmlns:m="http://schemas.openxmlformats.org/officeDocument/2006/math" xmlns:aink="http://schemas.microsoft.com/office/drawing/2016/ink" xmlns:am3d="http://schemas.microsoft.com/office/drawing/2017/model3d" xmlns:oel="http://schemas.microsoft.com/office/2019/extlst" xmlns:r="http://schemas.openxmlformats.org/officeDocument/2006/relationships" xmlns:wp14="http://schemas.microsoft.com/office/word/2010/wordprocessingDrawing" xmlns:wp="http://schemas.openxmlformats.org/drawingml/2006/wordprocessingDrawing" xmlns:wpg="http://schemas.microsoft.com/office/word/2010/wordprocessingGroup" xmlns:wpi="http://schemas.microsoft.com/office/word/2010/wordprocessingInk" xmlns:wps="http://schemas.microsoft.com/office/word/2010/wordprocessingShape" xmlns:o="urn:schemas-microsoft-com:office:office" xmlns:v="urn:schemas-microsoft-com:vml" xmlns:w10="urn:schemas-microsoft-com:office:word" xmlns:w="http://schemas.openxmlformats.org/wordprocessingml/2006/main" xmlns:w14="http://schemas.microsoft.com/office/word/2010/wordml" xmlns:w15="http://schemas.microsoft.com/office/word/2012/wordml" xmlns:w16cex="http://schemas.microsoft.com/office/word/2018/wordml/cex" xmlns:w16cid="http://schemas.microsoft.com/office/word/2016/wordml/cid" xmlns:w16="http://schemas.microsoft.com/office/word/2018/wordml" xmlns:w16sdtdh="http://schemas.microsoft.com/office/word/2020/wordml/sdtdatahash" xmlns:w16sdtfl="http://schemas.microsoft.com/office/word/2024/wordml/sdtformatlock" xmlns:w16se="http://schemas.microsoft.com/office/word/2015/wordml/symex" xmlns:w16du="http://schemas.microsoft.com/office/word/2023/wordml/word16du" xmlns:wne="http://schemas.microsoft.com/office/word/2006/wordml" mc:Ignorable="w14 w15 w16se w16cid w16 w16cex w16sdtdh w16sdtfl w16du wp14">
   <w:p>
     <w:pPr>
       <w:pStyle w:val="Footer"/>
@@ -5055,7 +5382,7 @@
 </file>
 
 <file path=word/footer2.xml><?xml version="1.0" encoding="utf-8"?>
-<w:ftr xmlns:wpc="http://schemas.microsoft.com/office/word/2010/wordprocessingCanvas" xmlns:cx="http://schemas.microsoft.com/office/drawing/2014/chartex" xmlns:cx1="http://schemas.microsoft.com/office/drawing/2015/9/8/chartex" xmlns:cx2="http://schemas.microsoft.com/office/drawing/2015/10/21/chartex" xmlns:cx3="http://schemas.microsoft.com/office/drawing/2016/5/9/chartex" xmlns:cx4="http://schemas.microsoft.com/office/drawing/2016/5/10/chartex" xmlns:cx5="http://schemas.microsoft.com/office/drawing/2016/5/11/chartex" xmlns:cx6="http://schemas.microsoft.com/office/drawing/2016/5/12/chartex" xmlns:cx7="http://schemas.microsoft.com/office/drawing/2016/5/13/chartex" xmlns:cx8="http://schemas.microsoft.com/office/drawing/2016/5/14/chartex" xmlns:mc="http://schemas.openxmlformats.org/markup-compatibility/2006" xmlns:aink="http://schemas.microsoft.com/office/drawing/2016/ink" xmlns:am3d="http://schemas.microsoft.com/office/drawing/2017/model3d" xmlns:o="urn:schemas-microsoft-com:office:office" xmlns:oel="http://schemas.microsoft.com/office/2019/extlst" xmlns:r="http://schemas.openxmlformats.org/officeDocument/2006/relationships" xmlns:m="http://schemas.openxmlformats.org/officeDocument/2006/math" xmlns:v="urn:schemas-microsoft-com:vml" xmlns:wp14="http://schemas.microsoft.com/office/word/2010/wordprocessingDrawing" xmlns:wp="http://schemas.openxmlformats.org/drawingml/2006/wordprocessingDrawing" xmlns:w10="urn:schemas-microsoft-com:office:word" xmlns:w="http://schemas.openxmlformats.org/wordprocessingml/2006/main" xmlns:w14="http://schemas.microsoft.com/office/word/2010/wordml" xmlns:w15="http://schemas.microsoft.com/office/word/2012/wordml" xmlns:w16cex="http://schemas.microsoft.com/office/word/2018/wordml/cex" xmlns:w16cid="http://schemas.microsoft.com/office/word/2016/wordml/cid" xmlns:w16="http://schemas.microsoft.com/office/word/2018/wordml" xmlns:w16du="http://schemas.microsoft.com/office/word/2023/wordml/word16du" xmlns:w16sdtdh="http://schemas.microsoft.com/office/word/2020/wordml/sdtdatahash" xmlns:w16sdtfl="http://schemas.microsoft.com/office/word/2024/wordml/sdtformatlock" xmlns:w16se="http://schemas.microsoft.com/office/word/2015/wordml/symex" xmlns:wpg="http://schemas.microsoft.com/office/word/2010/wordprocessingGroup" xmlns:wpi="http://schemas.microsoft.com/office/word/2010/wordprocessingInk" xmlns:wne="http://schemas.microsoft.com/office/word/2006/wordml" xmlns:wps="http://schemas.microsoft.com/office/word/2010/wordprocessingShape" mc:Ignorable="w14 w15 w16se w16cid w16 w16cex w16sdtdh w16sdtfl w16du wp14">
+<w:ftr xmlns:wpc="http://schemas.microsoft.com/office/word/2010/wordprocessingCanvas" xmlns:cx="http://schemas.microsoft.com/office/drawing/2014/chartex" xmlns:cx1="http://schemas.microsoft.com/office/drawing/2015/9/8/chartex" xmlns:cx2="http://schemas.microsoft.com/office/drawing/2015/10/21/chartex" xmlns:cx3="http://schemas.microsoft.com/office/drawing/2016/5/9/chartex" xmlns:cx4="http://schemas.microsoft.com/office/drawing/2016/5/10/chartex" xmlns:cx5="http://schemas.microsoft.com/office/drawing/2016/5/11/chartex" xmlns:cx6="http://schemas.microsoft.com/office/drawing/2016/5/12/chartex" xmlns:cx7="http://schemas.microsoft.com/office/drawing/2016/5/13/chartex" xmlns:cx8="http://schemas.microsoft.com/office/drawing/2016/5/14/chartex" xmlns:mc="http://schemas.openxmlformats.org/markup-compatibility/2006" xmlns:m="http://schemas.openxmlformats.org/officeDocument/2006/math" xmlns:aink="http://schemas.microsoft.com/office/drawing/2016/ink" xmlns:am3d="http://schemas.microsoft.com/office/drawing/2017/model3d" xmlns:oel="http://schemas.microsoft.com/office/2019/extlst" xmlns:r="http://schemas.openxmlformats.org/officeDocument/2006/relationships" xmlns:wp14="http://schemas.microsoft.com/office/word/2010/wordprocessingDrawing" xmlns:wp="http://schemas.openxmlformats.org/drawingml/2006/wordprocessingDrawing" xmlns:wpg="http://schemas.microsoft.com/office/word/2010/wordprocessingGroup" xmlns:wpi="http://schemas.microsoft.com/office/word/2010/wordprocessingInk" xmlns:wps="http://schemas.microsoft.com/office/word/2010/wordprocessingShape" xmlns:o="urn:schemas-microsoft-com:office:office" xmlns:v="urn:schemas-microsoft-com:vml" xmlns:w10="urn:schemas-microsoft-com:office:word" xmlns:w="http://schemas.openxmlformats.org/wordprocessingml/2006/main" xmlns:w14="http://schemas.microsoft.com/office/word/2010/wordml" xmlns:w15="http://schemas.microsoft.com/office/word/2012/wordml" xmlns:w16cex="http://schemas.microsoft.com/office/word/2018/wordml/cex" xmlns:w16cid="http://schemas.microsoft.com/office/word/2016/wordml/cid" xmlns:w16="http://schemas.microsoft.com/office/word/2018/wordml" xmlns:w16sdtdh="http://schemas.microsoft.com/office/word/2020/wordml/sdtdatahash" xmlns:w16sdtfl="http://schemas.microsoft.com/office/word/2024/wordml/sdtformatlock" xmlns:w16se="http://schemas.microsoft.com/office/word/2015/wordml/symex" xmlns:w16du="http://schemas.microsoft.com/office/word/2023/wordml/word16du" xmlns:wne="http://schemas.microsoft.com/office/word/2006/wordml" mc:Ignorable="w14 w15 w16se w16cid w16 w16cex w16sdtdh w16sdtfl w16du wp14">
   <w:p>
     <w:pPr>
       <w:pStyle w:val="Footer"/>
@@ -5065,7 +5392,7 @@
 </file>
 
 <file path=word/footer3.xml><?xml version="1.0" encoding="utf-8"?>
-<w:ftr xmlns:wpc="http://schemas.microsoft.com/office/word/2010/wordprocessingCanvas" xmlns:cx="http://schemas.microsoft.com/office/drawing/2014/chartex" xmlns:cx1="http://schemas.microsoft.com/office/drawing/2015/9/8/chartex" xmlns:cx2="http://schemas.microsoft.com/office/drawing/2015/10/21/chartex" xmlns:cx3="http://schemas.microsoft.com/office/drawing/2016/5/9/chartex" xmlns:cx4="http://schemas.microsoft.com/office/drawing/2016/5/10/chartex" xmlns:cx5="http://schemas.microsoft.com/office/drawing/2016/5/11/chartex" xmlns:cx6="http://schemas.microsoft.com/office/drawing/2016/5/12/chartex" xmlns:cx7="http://schemas.microsoft.com/office/drawing/2016/5/13/chartex" xmlns:cx8="http://schemas.microsoft.com/office/drawing/2016/5/14/chartex" xmlns:mc="http://schemas.openxmlformats.org/markup-compatibility/2006" xmlns:aink="http://schemas.microsoft.com/office/drawing/2016/ink" xmlns:am3d="http://schemas.microsoft.com/office/drawing/2017/model3d" xmlns:o="urn:schemas-microsoft-com:office:office" xmlns:oel="http://schemas.microsoft.com/office/2019/extlst" xmlns:r="http://schemas.openxmlformats.org/officeDocument/2006/relationships" xmlns:m="http://schemas.openxmlformats.org/officeDocument/2006/math" xmlns:v="urn:schemas-microsoft-com:vml" xmlns:wp14="http://schemas.microsoft.com/office/word/2010/wordprocessingDrawing" xmlns:wp="http://schemas.openxmlformats.org/drawingml/2006/wordprocessingDrawing" xmlns:w10="urn:schemas-microsoft-com:office:word" xmlns:w="http://schemas.openxmlformats.org/wordprocessingml/2006/main" xmlns:w14="http://schemas.microsoft.com/office/word/2010/wordml" xmlns:w15="http://schemas.microsoft.com/office/word/2012/wordml" xmlns:w16cex="http://schemas.microsoft.com/office/word/2018/wordml/cex" xmlns:w16cid="http://schemas.microsoft.com/office/word/2016/wordml/cid" xmlns:w16="http://schemas.microsoft.com/office/word/2018/wordml" xmlns:w16du="http://schemas.microsoft.com/office/word/2023/wordml/word16du" xmlns:w16sdtdh="http://schemas.microsoft.com/office/word/2020/wordml/sdtdatahash" xmlns:w16sdtfl="http://schemas.microsoft.com/office/word/2024/wordml/sdtformatlock" xmlns:w16se="http://schemas.microsoft.com/office/word/2015/wordml/symex" xmlns:wpg="http://schemas.microsoft.com/office/word/2010/wordprocessingGroup" xmlns:wpi="http://schemas.microsoft.com/office/word/2010/wordprocessingInk" xmlns:wne="http://schemas.microsoft.com/office/word/2006/wordml" xmlns:wps="http://schemas.microsoft.com/office/word/2010/wordprocessingShape" mc:Ignorable="w14 w15 w16se w16cid w16 w16cex w16sdtdh w16sdtfl w16du wp14">
+<w:ftr xmlns:wpc="http://schemas.microsoft.com/office/word/2010/wordprocessingCanvas" xmlns:cx="http://schemas.microsoft.com/office/drawing/2014/chartex" xmlns:cx1="http://schemas.microsoft.com/office/drawing/2015/9/8/chartex" xmlns:cx2="http://schemas.microsoft.com/office/drawing/2015/10/21/chartex" xmlns:cx3="http://schemas.microsoft.com/office/drawing/2016/5/9/chartex" xmlns:cx4="http://schemas.microsoft.com/office/drawing/2016/5/10/chartex" xmlns:cx5="http://schemas.microsoft.com/office/drawing/2016/5/11/chartex" xmlns:cx6="http://schemas.microsoft.com/office/drawing/2016/5/12/chartex" xmlns:cx7="http://schemas.microsoft.com/office/drawing/2016/5/13/chartex" xmlns:cx8="http://schemas.microsoft.com/office/drawing/2016/5/14/chartex" xmlns:mc="http://schemas.openxmlformats.org/markup-compatibility/2006" xmlns:m="http://schemas.openxmlformats.org/officeDocument/2006/math" xmlns:aink="http://schemas.microsoft.com/office/drawing/2016/ink" xmlns:am3d="http://schemas.microsoft.com/office/drawing/2017/model3d" xmlns:oel="http://schemas.microsoft.com/office/2019/extlst" xmlns:r="http://schemas.openxmlformats.org/officeDocument/2006/relationships" xmlns:wp14="http://schemas.microsoft.com/office/word/2010/wordprocessingDrawing" xmlns:wp="http://schemas.openxmlformats.org/drawingml/2006/wordprocessingDrawing" xmlns:wpg="http://schemas.microsoft.com/office/word/2010/wordprocessingGroup" xmlns:wpi="http://schemas.microsoft.com/office/word/2010/wordprocessingInk" xmlns:wps="http://schemas.microsoft.com/office/word/2010/wordprocessingShape" xmlns:o="urn:schemas-microsoft-com:office:office" xmlns:v="urn:schemas-microsoft-com:vml" xmlns:w10="urn:schemas-microsoft-com:office:word" xmlns:w="http://schemas.openxmlformats.org/wordprocessingml/2006/main" xmlns:w14="http://schemas.microsoft.com/office/word/2010/wordml" xmlns:w15="http://schemas.microsoft.com/office/word/2012/wordml" xmlns:w16cex="http://schemas.microsoft.com/office/word/2018/wordml/cex" xmlns:w16cid="http://schemas.microsoft.com/office/word/2016/wordml/cid" xmlns:w16="http://schemas.microsoft.com/office/word/2018/wordml" xmlns:w16sdtdh="http://schemas.microsoft.com/office/word/2020/wordml/sdtdatahash" xmlns:w16sdtfl="http://schemas.microsoft.com/office/word/2024/wordml/sdtformatlock" xmlns:w16se="http://schemas.microsoft.com/office/word/2015/wordml/symex" xmlns:w16du="http://schemas.microsoft.com/office/word/2023/wordml/word16du" xmlns:wne="http://schemas.microsoft.com/office/word/2006/wordml" mc:Ignorable="w14 w15 w16se w16cid w16 w16cex w16sdtdh w16sdtfl w16du wp14">
   <w:p>
     <w:pPr>
       <w:pStyle w:val="Footer"/>
@@ -5075,7 +5402,7 @@
 </file>
 
 <file path=word/footer4.xml><?xml version="1.0" encoding="utf-8"?>
-<w:ftr xmlns:wpc="http://schemas.microsoft.com/office/word/2010/wordprocessingCanvas" xmlns:cx="http://schemas.microsoft.com/office/drawing/2014/chartex" xmlns:cx1="http://schemas.microsoft.com/office/drawing/2015/9/8/chartex" xmlns:cx2="http://schemas.microsoft.com/office/drawing/2015/10/21/chartex" xmlns:cx3="http://schemas.microsoft.com/office/drawing/2016/5/9/chartex" xmlns:cx4="http://schemas.microsoft.com/office/drawing/2016/5/10/chartex" xmlns:cx5="http://schemas.microsoft.com/office/drawing/2016/5/11/chartex" xmlns:cx6="http://schemas.microsoft.com/office/drawing/2016/5/12/chartex" xmlns:cx7="http://schemas.microsoft.com/office/drawing/2016/5/13/chartex" xmlns:cx8="http://schemas.microsoft.com/office/drawing/2016/5/14/chartex" xmlns:mc="http://schemas.openxmlformats.org/markup-compatibility/2006" xmlns:aink="http://schemas.microsoft.com/office/drawing/2016/ink" xmlns:am3d="http://schemas.microsoft.com/office/drawing/2017/model3d" xmlns:o="urn:schemas-microsoft-com:office:office" xmlns:oel="http://schemas.microsoft.com/office/2019/extlst" xmlns:r="http://schemas.openxmlformats.org/officeDocument/2006/relationships" xmlns:m="http://schemas.openxmlformats.org/officeDocument/2006/math" xmlns:v="urn:schemas-microsoft-com:vml" xmlns:wp14="http://schemas.microsoft.com/office/word/2010/wordprocessingDrawing" xmlns:wp="http://schemas.openxmlformats.org/drawingml/2006/wordprocessingDrawing" xmlns:w10="urn:schemas-microsoft-com:office:word" xmlns:w="http://schemas.openxmlformats.org/wordprocessingml/2006/main" xmlns:w14="http://schemas.microsoft.com/office/word/2010/wordml" xmlns:w15="http://schemas.microsoft.com/office/word/2012/wordml" xmlns:w16cex="http://schemas.microsoft.com/office/word/2018/wordml/cex" xmlns:w16cid="http://schemas.microsoft.com/office/word/2016/wordml/cid" xmlns:w16="http://schemas.microsoft.com/office/word/2018/wordml" xmlns:w16du="http://schemas.microsoft.com/office/word/2023/wordml/word16du" xmlns:w16sdtdh="http://schemas.microsoft.com/office/word/2020/wordml/sdtdatahash" xmlns:w16sdtfl="http://schemas.microsoft.com/office/word/2024/wordml/sdtformatlock" xmlns:w16se="http://schemas.microsoft.com/office/word/2015/wordml/symex" xmlns:wpg="http://schemas.microsoft.com/office/word/2010/wordprocessingGroup" xmlns:wpi="http://schemas.microsoft.com/office/word/2010/wordprocessingInk" xmlns:wne="http://schemas.microsoft.com/office/word/2006/wordml" xmlns:wps="http://schemas.microsoft.com/office/word/2010/wordprocessingShape" mc:Ignorable="w14 w15 w16se w16cid w16 w16cex w16sdtdh w16sdtfl w16du wp14">
+<w:ftr xmlns:wpc="http://schemas.microsoft.com/office/word/2010/wordprocessingCanvas" xmlns:cx="http://schemas.microsoft.com/office/drawing/2014/chartex" xmlns:cx1="http://schemas.microsoft.com/office/drawing/2015/9/8/chartex" xmlns:cx2="http://schemas.microsoft.com/office/drawing/2015/10/21/chartex" xmlns:cx3="http://schemas.microsoft.com/office/drawing/2016/5/9/chartex" xmlns:cx4="http://schemas.microsoft.com/office/drawing/2016/5/10/chartex" xmlns:cx5="http://schemas.microsoft.com/office/drawing/2016/5/11/chartex" xmlns:cx6="http://schemas.microsoft.com/office/drawing/2016/5/12/chartex" xmlns:cx7="http://schemas.microsoft.com/office/drawing/2016/5/13/chartex" xmlns:cx8="http://schemas.microsoft.com/office/drawing/2016/5/14/chartex" xmlns:mc="http://schemas.openxmlformats.org/markup-compatibility/2006" xmlns:m="http://schemas.openxmlformats.org/officeDocument/2006/math" xmlns:aink="http://schemas.microsoft.com/office/drawing/2016/ink" xmlns:am3d="http://schemas.microsoft.com/office/drawing/2017/model3d" xmlns:oel="http://schemas.microsoft.com/office/2019/extlst" xmlns:r="http://schemas.openxmlformats.org/officeDocument/2006/relationships" xmlns:wp14="http://schemas.microsoft.com/office/word/2010/wordprocessingDrawing" xmlns:wp="http://schemas.openxmlformats.org/drawingml/2006/wordprocessingDrawing" xmlns:wpg="http://schemas.microsoft.com/office/word/2010/wordprocessingGroup" xmlns:wpi="http://schemas.microsoft.com/office/word/2010/wordprocessingInk" xmlns:wps="http://schemas.microsoft.com/office/word/2010/wordprocessingShape" xmlns:o="urn:schemas-microsoft-com:office:office" xmlns:v="urn:schemas-microsoft-com:vml" xmlns:w10="urn:schemas-microsoft-com:office:word" xmlns:w="http://schemas.openxmlformats.org/wordprocessingml/2006/main" xmlns:w14="http://schemas.microsoft.com/office/word/2010/wordml" xmlns:w15="http://schemas.microsoft.com/office/word/2012/wordml" xmlns:w16cex="http://schemas.microsoft.com/office/word/2018/wordml/cex" xmlns:w16cid="http://schemas.microsoft.com/office/word/2016/wordml/cid" xmlns:w16="http://schemas.microsoft.com/office/word/2018/wordml" xmlns:w16sdtdh="http://schemas.microsoft.com/office/word/2020/wordml/sdtdatahash" xmlns:w16sdtfl="http://schemas.microsoft.com/office/word/2024/wordml/sdtformatlock" xmlns:w16se="http://schemas.microsoft.com/office/word/2015/wordml/symex" xmlns:w16du="http://schemas.microsoft.com/office/word/2023/wordml/word16du" xmlns:wne="http://schemas.microsoft.com/office/word/2006/wordml" mc:Ignorable="w14 w15 w16se w16cid w16 w16cex w16sdtdh w16sdtfl w16du wp14">
   <w:p>
     <w:pPr>
       <w:pBdr>
@@ -5151,7 +5478,7 @@
 </file>
 
 <file path=word/footnotes.xml><?xml version="1.0" encoding="utf-8"?>
-<w:footnotes xmlns:wpc="http://schemas.microsoft.com/office/word/2010/wordprocessingCanvas" xmlns:cx="http://schemas.microsoft.com/office/drawing/2014/chartex" xmlns:cx1="http://schemas.microsoft.com/office/drawing/2015/9/8/chartex" xmlns:cx2="http://schemas.microsoft.com/office/drawing/2015/10/21/chartex" xmlns:cx3="http://schemas.microsoft.com/office/drawing/2016/5/9/chartex" xmlns:cx4="http://schemas.microsoft.com/office/drawing/2016/5/10/chartex" xmlns:cx5="http://schemas.microsoft.com/office/drawing/2016/5/11/chartex" xmlns:cx6="http://schemas.microsoft.com/office/drawing/2016/5/12/chartex" xmlns:cx7="http://schemas.microsoft.com/office/drawing/2016/5/13/chartex" xmlns:cx8="http://schemas.microsoft.com/office/drawing/2016/5/14/chartex" xmlns:mc="http://schemas.openxmlformats.org/markup-compatibility/2006" xmlns:aink="http://schemas.microsoft.com/office/drawing/2016/ink" xmlns:am3d="http://schemas.microsoft.com/office/drawing/2017/model3d" xmlns:o="urn:schemas-microsoft-com:office:office" xmlns:oel="http://schemas.microsoft.com/office/2019/extlst" xmlns:r="http://schemas.openxmlformats.org/officeDocument/2006/relationships" xmlns:m="http://schemas.openxmlformats.org/officeDocument/2006/math" xmlns:v="urn:schemas-microsoft-com:vml" xmlns:wp14="http://schemas.microsoft.com/office/word/2010/wordprocessingDrawing" xmlns:wp="http://schemas.openxmlformats.org/drawingml/2006/wordprocessingDrawing" xmlns:w10="urn:schemas-microsoft-com:office:word" xmlns:w="http://schemas.openxmlformats.org/wordprocessingml/2006/main" xmlns:w14="http://schemas.microsoft.com/office/word/2010/wordml" xmlns:w15="http://schemas.microsoft.com/office/word/2012/wordml" xmlns:w16cex="http://schemas.microsoft.com/office/word/2018/wordml/cex" xmlns:w16cid="http://schemas.microsoft.com/office/word/2016/wordml/cid" xmlns:w16="http://schemas.microsoft.com/office/word/2018/wordml" xmlns:w16du="http://schemas.microsoft.com/office/word/2023/wordml/word16du" xmlns:w16sdtdh="http://schemas.microsoft.com/office/word/2020/wordml/sdtdatahash" xmlns:w16sdtfl="http://schemas.microsoft.com/office/word/2024/wordml/sdtformatlock" xmlns:w16se="http://schemas.microsoft.com/office/word/2015/wordml/symex" xmlns:wpg="http://schemas.microsoft.com/office/word/2010/wordprocessingGroup" xmlns:wpi="http://schemas.microsoft.com/office/word/2010/wordprocessingInk" xmlns:wne="http://schemas.microsoft.com/office/word/2006/wordml" xmlns:wps="http://schemas.microsoft.com/office/word/2010/wordprocessingShape" mc:Ignorable="w14 w15 w16se w16cid w16 w16cex w16sdtdh w16sdtfl w16du wp14">
+<w:footnotes xmlns:wpc="http://schemas.microsoft.com/office/word/2010/wordprocessingCanvas" xmlns:cx="http://schemas.microsoft.com/office/drawing/2014/chartex" xmlns:cx1="http://schemas.microsoft.com/office/drawing/2015/9/8/chartex" xmlns:cx2="http://schemas.microsoft.com/office/drawing/2015/10/21/chartex" xmlns:cx3="http://schemas.microsoft.com/office/drawing/2016/5/9/chartex" xmlns:cx4="http://schemas.microsoft.com/office/drawing/2016/5/10/chartex" xmlns:cx5="http://schemas.microsoft.com/office/drawing/2016/5/11/chartex" xmlns:cx6="http://schemas.microsoft.com/office/drawing/2016/5/12/chartex" xmlns:cx7="http://schemas.microsoft.com/office/drawing/2016/5/13/chartex" xmlns:cx8="http://schemas.microsoft.com/office/drawing/2016/5/14/chartex" xmlns:mc="http://schemas.openxmlformats.org/markup-compatibility/2006" xmlns:m="http://schemas.openxmlformats.org/officeDocument/2006/math" xmlns:aink="http://schemas.microsoft.com/office/drawing/2016/ink" xmlns:am3d="http://schemas.microsoft.com/office/drawing/2017/model3d" xmlns:oel="http://schemas.microsoft.com/office/2019/extlst" xmlns:r="http://schemas.openxmlformats.org/officeDocument/2006/relationships" xmlns:wp14="http://schemas.microsoft.com/office/word/2010/wordprocessingDrawing" xmlns:wp="http://schemas.openxmlformats.org/drawingml/2006/wordprocessingDrawing" xmlns:wpg="http://schemas.microsoft.com/office/word/2010/wordprocessingGroup" xmlns:wpi="http://schemas.microsoft.com/office/word/2010/wordprocessingInk" xmlns:wps="http://schemas.microsoft.com/office/word/2010/wordprocessingShape" xmlns:o="urn:schemas-microsoft-com:office:office" xmlns:v="urn:schemas-microsoft-com:vml" xmlns:w10="urn:schemas-microsoft-com:office:word" xmlns:w="http://schemas.openxmlformats.org/wordprocessingml/2006/main" xmlns:w14="http://schemas.microsoft.com/office/word/2010/wordml" xmlns:w15="http://schemas.microsoft.com/office/word/2012/wordml" xmlns:w16cex="http://schemas.microsoft.com/office/word/2018/wordml/cex" xmlns:w16cid="http://schemas.microsoft.com/office/word/2016/wordml/cid" xmlns:w16="http://schemas.microsoft.com/office/word/2018/wordml" xmlns:w16sdtdh="http://schemas.microsoft.com/office/word/2020/wordml/sdtdatahash" xmlns:w16sdtfl="http://schemas.microsoft.com/office/word/2024/wordml/sdtformatlock" xmlns:w16se="http://schemas.microsoft.com/office/word/2015/wordml/symex" xmlns:w16du="http://schemas.microsoft.com/office/word/2023/wordml/word16du" xmlns:wne="http://schemas.microsoft.com/office/word/2006/wordml" mc:Ignorable="w14 w15 w16se w16cid w16 w16cex w16sdtdh w16sdtfl w16du wp14">
   <w:footnote w:type="separator" w:id="-1">
     <w:p>
       <w:r>
@@ -5170,7 +5497,7 @@
 </file>
 
 <file path=word/header1.xml><?xml version="1.0" encoding="utf-8"?>
-<w:hdr xmlns:wpc="http://schemas.microsoft.com/office/word/2010/wordprocessingCanvas" xmlns:cx="http://schemas.microsoft.com/office/drawing/2014/chartex" xmlns:cx1="http://schemas.microsoft.com/office/drawing/2015/9/8/chartex" xmlns:cx2="http://schemas.microsoft.com/office/drawing/2015/10/21/chartex" xmlns:cx3="http://schemas.microsoft.com/office/drawing/2016/5/9/chartex" xmlns:cx4="http://schemas.microsoft.com/office/drawing/2016/5/10/chartex" xmlns:cx5="http://schemas.microsoft.com/office/drawing/2016/5/11/chartex" xmlns:cx6="http://schemas.microsoft.com/office/drawing/2016/5/12/chartex" xmlns:cx7="http://schemas.microsoft.com/office/drawing/2016/5/13/chartex" xmlns:cx8="http://schemas.microsoft.com/office/drawing/2016/5/14/chartex" xmlns:mc="http://schemas.openxmlformats.org/markup-compatibility/2006" xmlns:aink="http://schemas.microsoft.com/office/drawing/2016/ink" xmlns:am3d="http://schemas.microsoft.com/office/drawing/2017/model3d" xmlns:o="urn:schemas-microsoft-com:office:office" xmlns:oel="http://schemas.microsoft.com/office/2019/extlst" xmlns:r="http://schemas.openxmlformats.org/officeDocument/2006/relationships" xmlns:m="http://schemas.openxmlformats.org/officeDocument/2006/math" xmlns:v="urn:schemas-microsoft-com:vml" xmlns:wp14="http://schemas.microsoft.com/office/word/2010/wordprocessingDrawing" xmlns:wp="http://schemas.openxmlformats.org/drawingml/2006/wordprocessingDrawing" xmlns:w10="urn:schemas-microsoft-com:office:word" xmlns:w="http://schemas.openxmlformats.org/wordprocessingml/2006/main" xmlns:w14="http://schemas.microsoft.com/office/word/2010/wordml" xmlns:w15="http://schemas.microsoft.com/office/word/2012/wordml" xmlns:w16cex="http://schemas.microsoft.com/office/word/2018/wordml/cex" xmlns:w16cid="http://schemas.microsoft.com/office/word/2016/wordml/cid" xmlns:w16="http://schemas.microsoft.com/office/word/2018/wordml" xmlns:w16du="http://schemas.microsoft.com/office/word/2023/wordml/word16du" xmlns:w16sdtdh="http://schemas.microsoft.com/office/word/2020/wordml/sdtdatahash" xmlns:w16sdtfl="http://schemas.microsoft.com/office/word/2024/wordml/sdtformatlock" xmlns:w16se="http://schemas.microsoft.com/office/word/2015/wordml/symex" xmlns:wpg="http://schemas.microsoft.com/office/word/2010/wordprocessingGroup" xmlns:wpi="http://schemas.microsoft.com/office/word/2010/wordprocessingInk" xmlns:wne="http://schemas.microsoft.com/office/word/2006/wordml" xmlns:wps="http://schemas.microsoft.com/office/word/2010/wordprocessingShape" mc:Ignorable="w14 w15 w16se w16cid w16 w16cex w16sdtdh w16sdtfl w16du wp14">
+<w:hdr xmlns:wpc="http://schemas.microsoft.com/office/word/2010/wordprocessingCanvas" xmlns:cx="http://schemas.microsoft.com/office/drawing/2014/chartex" xmlns:cx1="http://schemas.microsoft.com/office/drawing/2015/9/8/chartex" xmlns:cx2="http://schemas.microsoft.com/office/drawing/2015/10/21/chartex" xmlns:cx3="http://schemas.microsoft.com/office/drawing/2016/5/9/chartex" xmlns:cx4="http://schemas.microsoft.com/office/drawing/2016/5/10/chartex" xmlns:cx5="http://schemas.microsoft.com/office/drawing/2016/5/11/chartex" xmlns:cx6="http://schemas.microsoft.com/office/drawing/2016/5/12/chartex" xmlns:cx7="http://schemas.microsoft.com/office/drawing/2016/5/13/chartex" xmlns:cx8="http://schemas.microsoft.com/office/drawing/2016/5/14/chartex" xmlns:mc="http://schemas.openxmlformats.org/markup-compatibility/2006" xmlns:m="http://schemas.openxmlformats.org/officeDocument/2006/math" xmlns:aink="http://schemas.microsoft.com/office/drawing/2016/ink" xmlns:am3d="http://schemas.microsoft.com/office/drawing/2017/model3d" xmlns:oel="http://schemas.microsoft.com/office/2019/extlst" xmlns:r="http://schemas.openxmlformats.org/officeDocument/2006/relationships" xmlns:wp14="http://schemas.microsoft.com/office/word/2010/wordprocessingDrawing" xmlns:wp="http://schemas.openxmlformats.org/drawingml/2006/wordprocessingDrawing" xmlns:wpg="http://schemas.microsoft.com/office/word/2010/wordprocessingGroup" xmlns:wpi="http://schemas.microsoft.com/office/word/2010/wordprocessingInk" xmlns:wps="http://schemas.microsoft.com/office/word/2010/wordprocessingShape" xmlns:o="urn:schemas-microsoft-com:office:office" xmlns:v="urn:schemas-microsoft-com:vml" xmlns:w10="urn:schemas-microsoft-com:office:word" xmlns:w="http://schemas.openxmlformats.org/wordprocessingml/2006/main" xmlns:w14="http://schemas.microsoft.com/office/word/2010/wordml" xmlns:w15="http://schemas.microsoft.com/office/word/2012/wordml" xmlns:w16cex="http://schemas.microsoft.com/office/word/2018/wordml/cex" xmlns:w16cid="http://schemas.microsoft.com/office/word/2016/wordml/cid" xmlns:w16="http://schemas.microsoft.com/office/word/2018/wordml" xmlns:w16sdtdh="http://schemas.microsoft.com/office/word/2020/wordml/sdtdatahash" xmlns:w16sdtfl="http://schemas.microsoft.com/office/word/2024/wordml/sdtformatlock" xmlns:w16se="http://schemas.microsoft.com/office/word/2015/wordml/symex" xmlns:w16du="http://schemas.microsoft.com/office/word/2023/wordml/word16du" xmlns:wne="http://schemas.microsoft.com/office/word/2006/wordml" mc:Ignorable="w14 w15 w16se w16cid w16 w16cex w16sdtdh w16sdtfl w16du wp14">
   <w:p>
     <w:pPr>
       <w:pStyle w:val="Header"/>
@@ -5180,7 +5507,7 @@
 </file>
 
 <file path=word/header2.xml><?xml version="1.0" encoding="utf-8"?>
-<w:hdr xmlns:wpc="http://schemas.microsoft.com/office/word/2010/wordprocessingCanvas" xmlns:cx="http://schemas.microsoft.com/office/drawing/2014/chartex" xmlns:cx1="http://schemas.microsoft.com/office/drawing/2015/9/8/chartex" xmlns:cx2="http://schemas.microsoft.com/office/drawing/2015/10/21/chartex" xmlns:cx3="http://schemas.microsoft.com/office/drawing/2016/5/9/chartex" xmlns:cx4="http://schemas.microsoft.com/office/drawing/2016/5/10/chartex" xmlns:cx5="http://schemas.microsoft.com/office/drawing/2016/5/11/chartex" xmlns:cx6="http://schemas.microsoft.com/office/drawing/2016/5/12/chartex" xmlns:cx7="http://schemas.microsoft.com/office/drawing/2016/5/13/chartex" xmlns:cx8="http://schemas.microsoft.com/office/drawing/2016/5/14/chartex" xmlns:mc="http://schemas.openxmlformats.org/markup-compatibility/2006" xmlns:aink="http://schemas.microsoft.com/office/drawing/2016/ink" xmlns:am3d="http://schemas.microsoft.com/office/drawing/2017/model3d" xmlns:o="urn:schemas-microsoft-com:office:office" xmlns:oel="http://schemas.microsoft.com/office/2019/extlst" xmlns:r="http://schemas.openxmlformats.org/officeDocument/2006/relationships" xmlns:m="http://schemas.openxmlformats.org/officeDocument/2006/math" xmlns:v="urn:schemas-microsoft-com:vml" xmlns:wp14="http://schemas.microsoft.com/office/word/2010/wordprocessingDrawing" xmlns:wp="http://schemas.openxmlformats.org/drawingml/2006/wordprocessingDrawing" xmlns:w10="urn:schemas-microsoft-com:office:word" xmlns:w="http://schemas.openxmlformats.org/wordprocessingml/2006/main" xmlns:w14="http://schemas.microsoft.com/office/word/2010/wordml" xmlns:w15="http://schemas.microsoft.com/office/word/2012/wordml" xmlns:w16cex="http://schemas.microsoft.com/office/word/2018/wordml/cex" xmlns:w16cid="http://schemas.microsoft.com/office/word/2016/wordml/cid" xmlns:w16="http://schemas.microsoft.com/office/word/2018/wordml" xmlns:w16du="http://schemas.microsoft.com/office/word/2023/wordml/word16du" xmlns:w16sdtdh="http://schemas.microsoft.com/office/word/2020/wordml/sdtdatahash" xmlns:w16sdtfl="http://schemas.microsoft.com/office/word/2024/wordml/sdtformatlock" xmlns:w16se="http://schemas.microsoft.com/office/word/2015/wordml/symex" xmlns:wpg="http://schemas.microsoft.com/office/word/2010/wordprocessingGroup" xmlns:wpi="http://schemas.microsoft.com/office/word/2010/wordprocessingInk" xmlns:wne="http://schemas.microsoft.com/office/word/2006/wordml" xmlns:wps="http://schemas.microsoft.com/office/word/2010/wordprocessingShape" mc:Ignorable="w14 w15 w16se w16cid w16 w16cex w16sdtdh w16sdtfl w16du wp14">
+<w:hdr xmlns:wpc="http://schemas.microsoft.com/office/word/2010/wordprocessingCanvas" xmlns:cx="http://schemas.microsoft.com/office/drawing/2014/chartex" xmlns:cx1="http://schemas.microsoft.com/office/drawing/2015/9/8/chartex" xmlns:cx2="http://schemas.microsoft.com/office/drawing/2015/10/21/chartex" xmlns:cx3="http://schemas.microsoft.com/office/drawing/2016/5/9/chartex" xmlns:cx4="http://schemas.microsoft.com/office/drawing/2016/5/10/chartex" xmlns:cx5="http://schemas.microsoft.com/office/drawing/2016/5/11/chartex" xmlns:cx6="http://schemas.microsoft.com/office/drawing/2016/5/12/chartex" xmlns:cx7="http://schemas.microsoft.com/office/drawing/2016/5/13/chartex" xmlns:cx8="http://schemas.microsoft.com/office/drawing/2016/5/14/chartex" xmlns:mc="http://schemas.openxmlformats.org/markup-compatibility/2006" xmlns:m="http://schemas.openxmlformats.org/officeDocument/2006/math" xmlns:aink="http://schemas.microsoft.com/office/drawing/2016/ink" xmlns:am3d="http://schemas.microsoft.com/office/drawing/2017/model3d" xmlns:oel="http://schemas.microsoft.com/office/2019/extlst" xmlns:r="http://schemas.openxmlformats.org/officeDocument/2006/relationships" xmlns:wp14="http://schemas.microsoft.com/office/word/2010/wordprocessingDrawing" xmlns:wp="http://schemas.openxmlformats.org/drawingml/2006/wordprocessingDrawing" xmlns:wpg="http://schemas.microsoft.com/office/word/2010/wordprocessingGroup" xmlns:wpi="http://schemas.microsoft.com/office/word/2010/wordprocessingInk" xmlns:wps="http://schemas.microsoft.com/office/word/2010/wordprocessingShape" xmlns:o="urn:schemas-microsoft-com:office:office" xmlns:v="urn:schemas-microsoft-com:vml" xmlns:w10="urn:schemas-microsoft-com:office:word" xmlns:w="http://schemas.openxmlformats.org/wordprocessingml/2006/main" xmlns:w14="http://schemas.microsoft.com/office/word/2010/wordml" xmlns:w15="http://schemas.microsoft.com/office/word/2012/wordml" xmlns:w16cex="http://schemas.microsoft.com/office/word/2018/wordml/cex" xmlns:w16cid="http://schemas.microsoft.com/office/word/2016/wordml/cid" xmlns:w16="http://schemas.microsoft.com/office/word/2018/wordml" xmlns:w16sdtdh="http://schemas.microsoft.com/office/word/2020/wordml/sdtdatahash" xmlns:w16sdtfl="http://schemas.microsoft.com/office/word/2024/wordml/sdtformatlock" xmlns:w16se="http://schemas.microsoft.com/office/word/2015/wordml/symex" xmlns:w16du="http://schemas.microsoft.com/office/word/2023/wordml/word16du" xmlns:wne="http://schemas.microsoft.com/office/word/2006/wordml" mc:Ignorable="w14 w15 w16se w16cid w16 w16cex w16sdtdh w16sdtfl w16du wp14">
   <w:p>
     <w:pPr>
       <w:pStyle w:val="Header"/>
@@ -5190,7 +5517,7 @@
 </file>
 
 <file path=word/header3.xml><?xml version="1.0" encoding="utf-8"?>
-<w:hdr xmlns:wpc="http://schemas.microsoft.com/office/word/2010/wordprocessingCanvas" xmlns:cx="http://schemas.microsoft.com/office/drawing/2014/chartex" xmlns:cx1="http://schemas.microsoft.com/office/drawing/2015/9/8/chartex" xmlns:cx2="http://schemas.microsoft.com/office/drawing/2015/10/21/chartex" xmlns:cx3="http://schemas.microsoft.com/office/drawing/2016/5/9/chartex" xmlns:cx4="http://schemas.microsoft.com/office/drawing/2016/5/10/chartex" xmlns:cx5="http://schemas.microsoft.com/office/drawing/2016/5/11/chartex" xmlns:cx6="http://schemas.microsoft.com/office/drawing/2016/5/12/chartex" xmlns:cx7="http://schemas.microsoft.com/office/drawing/2016/5/13/chartex" xmlns:cx8="http://schemas.microsoft.com/office/drawing/2016/5/14/chartex" xmlns:mc="http://schemas.openxmlformats.org/markup-compatibility/2006" xmlns:aink="http://schemas.microsoft.com/office/drawing/2016/ink" xmlns:am3d="http://schemas.microsoft.com/office/drawing/2017/model3d" xmlns:o="urn:schemas-microsoft-com:office:office" xmlns:oel="http://schemas.microsoft.com/office/2019/extlst" xmlns:r="http://schemas.openxmlformats.org/officeDocument/2006/relationships" xmlns:m="http://schemas.openxmlformats.org/officeDocument/2006/math" xmlns:v="urn:schemas-microsoft-com:vml" xmlns:wp14="http://schemas.microsoft.com/office/word/2010/wordprocessingDrawing" xmlns:wp="http://schemas.openxmlformats.org/drawingml/2006/wordprocessingDrawing" xmlns:w10="urn:schemas-microsoft-com:office:word" xmlns:w="http://schemas.openxmlformats.org/wordprocessingml/2006/main" xmlns:w14="http://schemas.microsoft.com/office/word/2010/wordml" xmlns:w15="http://schemas.microsoft.com/office/word/2012/wordml" xmlns:w16cex="http://schemas.microsoft.com/office/word/2018/wordml/cex" xmlns:w16cid="http://schemas.microsoft.com/office/word/2016/wordml/cid" xmlns:w16="http://schemas.microsoft.com/office/word/2018/wordml" xmlns:w16du="http://schemas.microsoft.com/office/word/2023/wordml/word16du" xmlns:w16sdtdh="http://schemas.microsoft.com/office/word/2020/wordml/sdtdatahash" xmlns:w16sdtfl="http://schemas.microsoft.com/office/word/2024/wordml/sdtformatlock" xmlns:w16se="http://schemas.microsoft.com/office/word/2015/wordml/symex" xmlns:wpg="http://schemas.microsoft.com/office/word/2010/wordprocessingGroup" xmlns:wpi="http://schemas.microsoft.com/office/word/2010/wordprocessingInk" xmlns:wne="http://schemas.microsoft.com/office/word/2006/wordml" xmlns:wps="http://schemas.microsoft.com/office/word/2010/wordprocessingShape" mc:Ignorable="w14 w15 w16se w16cid w16 w16cex w16sdtdh w16sdtfl w16du wp14">
+<w:hdr xmlns:wpc="http://schemas.microsoft.com/office/word/2010/wordprocessingCanvas" xmlns:cx="http://schemas.microsoft.com/office/drawing/2014/chartex" xmlns:cx1="http://schemas.microsoft.com/office/drawing/2015/9/8/chartex" xmlns:cx2="http://schemas.microsoft.com/office/drawing/2015/10/21/chartex" xmlns:cx3="http://schemas.microsoft.com/office/drawing/2016/5/9/chartex" xmlns:cx4="http://schemas.microsoft.com/office/drawing/2016/5/10/chartex" xmlns:cx5="http://schemas.microsoft.com/office/drawing/2016/5/11/chartex" xmlns:cx6="http://schemas.microsoft.com/office/drawing/2016/5/12/chartex" xmlns:cx7="http://schemas.microsoft.com/office/drawing/2016/5/13/chartex" xmlns:cx8="http://schemas.microsoft.com/office/drawing/2016/5/14/chartex" xmlns:mc="http://schemas.openxmlformats.org/markup-compatibility/2006" xmlns:m="http://schemas.openxmlformats.org/officeDocument/2006/math" xmlns:aink="http://schemas.microsoft.com/office/drawing/2016/ink" xmlns:am3d="http://schemas.microsoft.com/office/drawing/2017/model3d" xmlns:oel="http://schemas.microsoft.com/office/2019/extlst" xmlns:r="http://schemas.openxmlformats.org/officeDocument/2006/relationships" xmlns:wp14="http://schemas.microsoft.com/office/word/2010/wordprocessingDrawing" xmlns:wp="http://schemas.openxmlformats.org/drawingml/2006/wordprocessingDrawing" xmlns:wpg="http://schemas.microsoft.com/office/word/2010/wordprocessingGroup" xmlns:wpi="http://schemas.microsoft.com/office/word/2010/wordprocessingInk" xmlns:wps="http://schemas.microsoft.com/office/word/2010/wordprocessingShape" xmlns:o="urn:schemas-microsoft-com:office:office" xmlns:v="urn:schemas-microsoft-com:vml" xmlns:w10="urn:schemas-microsoft-com:office:word" xmlns:w="http://schemas.openxmlformats.org/wordprocessingml/2006/main" xmlns:w14="http://schemas.microsoft.com/office/word/2010/wordml" xmlns:w15="http://schemas.microsoft.com/office/word/2012/wordml" xmlns:w16cex="http://schemas.microsoft.com/office/word/2018/wordml/cex" xmlns:w16cid="http://schemas.microsoft.com/office/word/2016/wordml/cid" xmlns:w16="http://schemas.microsoft.com/office/word/2018/wordml" xmlns:w16sdtdh="http://schemas.microsoft.com/office/word/2020/wordml/sdtdatahash" xmlns:w16sdtfl="http://schemas.microsoft.com/office/word/2024/wordml/sdtformatlock" xmlns:w16se="http://schemas.microsoft.com/office/word/2015/wordml/symex" xmlns:w16du="http://schemas.microsoft.com/office/word/2023/wordml/word16du" xmlns:wne="http://schemas.microsoft.com/office/word/2006/wordml" mc:Ignorable="w14 w15 w16se w16cid w16 w16cex w16sdtdh w16sdtfl w16du wp14">
   <w:p>
     <w:pPr>
       <w:pStyle w:val="Header"/>
@@ -5200,7 +5527,7 @@
 </file>
 
 <file path=word/header4.xml><?xml version="1.0" encoding="utf-8"?>
-<w:hdr xmlns:wpc="http://schemas.microsoft.com/office/word/2010/wordprocessingCanvas" xmlns:cx="http://schemas.microsoft.com/office/drawing/2014/chartex" xmlns:cx1="http://schemas.microsoft.com/office/drawing/2015/9/8/chartex" xmlns:cx2="http://schemas.microsoft.com/office/drawing/2015/10/21/chartex" xmlns:cx3="http://schemas.microsoft.com/office/drawing/2016/5/9/chartex" xmlns:cx4="http://schemas.microsoft.com/office/drawing/2016/5/10/chartex" xmlns:cx5="http://schemas.microsoft.com/office/drawing/2016/5/11/chartex" xmlns:cx6="http://schemas.microsoft.com/office/drawing/2016/5/12/chartex" xmlns:cx7="http://schemas.microsoft.com/office/drawing/2016/5/13/chartex" xmlns:cx8="http://schemas.microsoft.com/office/drawing/2016/5/14/chartex" xmlns:mc="http://schemas.openxmlformats.org/markup-compatibility/2006" xmlns:aink="http://schemas.microsoft.com/office/drawing/2016/ink" xmlns:am3d="http://schemas.microsoft.com/office/drawing/2017/model3d" xmlns:o="urn:schemas-microsoft-com:office:office" xmlns:oel="http://schemas.microsoft.com/office/2019/extlst" xmlns:r="http://schemas.openxmlformats.org/officeDocument/2006/relationships" xmlns:m="http://schemas.openxmlformats.org/officeDocument/2006/math" xmlns:v="urn:schemas-microsoft-com:vml" xmlns:wp14="http://schemas.microsoft.com/office/word/2010/wordprocessingDrawing" xmlns:wp="http://schemas.openxmlformats.org/drawingml/2006/wordprocessingDrawing" xmlns:w10="urn:schemas-microsoft-com:office:word" xmlns:w="http://schemas.openxmlformats.org/wordprocessingml/2006/main" xmlns:w14="http://schemas.microsoft.com/office/word/2010/wordml" xmlns:w15="http://schemas.microsoft.com/office/word/2012/wordml" xmlns:w16cex="http://schemas.microsoft.com/office/word/2018/wordml/cex" xmlns:w16cid="http://schemas.microsoft.com/office/word/2016/wordml/cid" xmlns:w16="http://schemas.microsoft.com/office/word/2018/wordml" xmlns:w16du="http://schemas.microsoft.com/office/word/2023/wordml/word16du" xmlns:w16sdtdh="http://schemas.microsoft.com/office/word/2020/wordml/sdtdatahash" xmlns:w16sdtfl="http://schemas.microsoft.com/office/word/2024/wordml/sdtformatlock" xmlns:w16se="http://schemas.microsoft.com/office/word/2015/wordml/symex" xmlns:wpg="http://schemas.microsoft.com/office/word/2010/wordprocessingGroup" xmlns:wpi="http://schemas.microsoft.com/office/word/2010/wordprocessingInk" xmlns:wne="http://schemas.microsoft.com/office/word/2006/wordml" xmlns:wps="http://schemas.microsoft.com/office/word/2010/wordprocessingShape" mc:Ignorable="w14 w15 w16se w16cid w16 w16cex w16sdtdh w16sdtfl w16du wp14">
+<w:hdr xmlns:wpc="http://schemas.microsoft.com/office/word/2010/wordprocessingCanvas" xmlns:cx="http://schemas.microsoft.com/office/drawing/2014/chartex" xmlns:cx1="http://schemas.microsoft.com/office/drawing/2015/9/8/chartex" xmlns:cx2="http://schemas.microsoft.com/office/drawing/2015/10/21/chartex" xmlns:cx3="http://schemas.microsoft.com/office/drawing/2016/5/9/chartex" xmlns:cx4="http://schemas.microsoft.com/office/drawing/2016/5/10/chartex" xmlns:cx5="http://schemas.microsoft.com/office/drawing/2016/5/11/chartex" xmlns:cx6="http://schemas.microsoft.com/office/drawing/2016/5/12/chartex" xmlns:cx7="http://schemas.microsoft.com/office/drawing/2016/5/13/chartex" xmlns:cx8="http://schemas.microsoft.com/office/drawing/2016/5/14/chartex" xmlns:mc="http://schemas.openxmlformats.org/markup-compatibility/2006" xmlns:m="http://schemas.openxmlformats.org/officeDocument/2006/math" xmlns:aink="http://schemas.microsoft.com/office/drawing/2016/ink" xmlns:am3d="http://schemas.microsoft.com/office/drawing/2017/model3d" xmlns:oel="http://schemas.microsoft.com/office/2019/extlst" xmlns:r="http://schemas.openxmlformats.org/officeDocument/2006/relationships" xmlns:wp14="http://schemas.microsoft.com/office/word/2010/wordprocessingDrawing" xmlns:wp="http://schemas.openxmlformats.org/drawingml/2006/wordprocessingDrawing" xmlns:wpg="http://schemas.microsoft.com/office/word/2010/wordprocessingGroup" xmlns:wpi="http://schemas.microsoft.com/office/word/2010/wordprocessingInk" xmlns:wps="http://schemas.microsoft.com/office/word/2010/wordprocessingShape" xmlns:o="urn:schemas-microsoft-com:office:office" xmlns:v="urn:schemas-microsoft-com:vml" xmlns:w10="urn:schemas-microsoft-com:office:word" xmlns:w="http://schemas.openxmlformats.org/wordprocessingml/2006/main" xmlns:w14="http://schemas.microsoft.com/office/word/2010/wordml" xmlns:w15="http://schemas.microsoft.com/office/word/2012/wordml" xmlns:w16cex="http://schemas.microsoft.com/office/word/2018/wordml/cex" xmlns:w16cid="http://schemas.microsoft.com/office/word/2016/wordml/cid" xmlns:w16="http://schemas.microsoft.com/office/word/2018/wordml" xmlns:w16sdtdh="http://schemas.microsoft.com/office/word/2020/wordml/sdtdatahash" xmlns:w16sdtfl="http://schemas.microsoft.com/office/word/2024/wordml/sdtformatlock" xmlns:w16se="http://schemas.microsoft.com/office/word/2015/wordml/symex" xmlns:w16du="http://schemas.microsoft.com/office/word/2023/wordml/word16du" xmlns:wne="http://schemas.microsoft.com/office/word/2006/wordml" mc:Ignorable="w14 w15 w16se w16cid w16 w16cex w16sdtdh w16sdtfl w16du wp14">
   <w:p>
     <w:pPr>
       <w:pBdr>
@@ -5223,7 +5550,7 @@
 </file>
 
 <file path=word/numbering.xml><?xml version="1.0" encoding="utf-8"?>
-<w:numbering xmlns:wpc="http://schemas.microsoft.com/office/word/2010/wordprocessingCanvas" xmlns:cx="http://schemas.microsoft.com/office/drawing/2014/chartex" xmlns:cx1="http://schemas.microsoft.com/office/drawing/2015/9/8/chartex" xmlns:cx2="http://schemas.microsoft.com/office/drawing/2015/10/21/chartex" xmlns:cx3="http://schemas.microsoft.com/office/drawing/2016/5/9/chartex" xmlns:cx4="http://schemas.microsoft.com/office/drawing/2016/5/10/chartex" xmlns:cx5="http://schemas.microsoft.com/office/drawing/2016/5/11/chartex" xmlns:cx6="http://schemas.microsoft.com/office/drawing/2016/5/12/chartex" xmlns:cx7="http://schemas.microsoft.com/office/drawing/2016/5/13/chartex" xmlns:cx8="http://schemas.microsoft.com/office/drawing/2016/5/14/chartex" xmlns:mc="http://schemas.openxmlformats.org/markup-compatibility/2006" xmlns:aink="http://schemas.microsoft.com/office/drawing/2016/ink" xmlns:am3d="http://schemas.microsoft.com/office/drawing/2017/model3d" xmlns:o="urn:schemas-microsoft-com:office:office" xmlns:oel="http://schemas.microsoft.com/office/2019/extlst" xmlns:r="http://schemas.openxmlformats.org/officeDocument/2006/relationships" xmlns:m="http://schemas.openxmlformats.org/officeDocument/2006/math" xmlns:v="urn:schemas-microsoft-com:vml" xmlns:wp14="http://schemas.microsoft.com/office/word/2010/wordprocessingDrawing" xmlns:wp="http://schemas.openxmlformats.org/drawingml/2006/wordprocessingDrawing" xmlns:w10="urn:schemas-microsoft-com:office:word" xmlns:w="http://schemas.openxmlformats.org/wordprocessingml/2006/main" xmlns:w14="http://schemas.microsoft.com/office/word/2010/wordml" xmlns:w15="http://schemas.microsoft.com/office/word/2012/wordml" xmlns:w16cex="http://schemas.microsoft.com/office/word/2018/wordml/cex" xmlns:w16cid="http://schemas.microsoft.com/office/word/2016/wordml/cid" xmlns:w16="http://schemas.microsoft.com/office/word/2018/wordml" xmlns:w16du="http://schemas.microsoft.com/office/word/2023/wordml/word16du" xmlns:w16sdtdh="http://schemas.microsoft.com/office/word/2020/wordml/sdtdatahash" xmlns:w16sdtfl="http://schemas.microsoft.com/office/word/2024/wordml/sdtformatlock" xmlns:w16se="http://schemas.microsoft.com/office/word/2015/wordml/symex" xmlns:wpg="http://schemas.microsoft.com/office/word/2010/wordprocessingGroup" xmlns:wpi="http://schemas.microsoft.com/office/word/2010/wordprocessingInk" xmlns:wne="http://schemas.microsoft.com/office/word/2006/wordml" xmlns:wps="http://schemas.microsoft.com/office/word/2010/wordprocessingShape" mc:Ignorable="w14 w15 w16se w16cid w16 w16cex w16sdtdh w16sdtfl w16du wp14">
+<w:numbering xmlns:wpc="http://schemas.microsoft.com/office/word/2010/wordprocessingCanvas" xmlns:cx="http://schemas.microsoft.com/office/drawing/2014/chartex" xmlns:cx1="http://schemas.microsoft.com/office/drawing/2015/9/8/chartex" xmlns:cx2="http://schemas.microsoft.com/office/drawing/2015/10/21/chartex" xmlns:cx3="http://schemas.microsoft.com/office/drawing/2016/5/9/chartex" xmlns:cx4="http://schemas.microsoft.com/office/drawing/2016/5/10/chartex" xmlns:cx5="http://schemas.microsoft.com/office/drawing/2016/5/11/chartex" xmlns:cx6="http://schemas.microsoft.com/office/drawing/2016/5/12/chartex" xmlns:cx7="http://schemas.microsoft.com/office/drawing/2016/5/13/chartex" xmlns:cx8="http://schemas.microsoft.com/office/drawing/2016/5/14/chartex" xmlns:mc="http://schemas.openxmlformats.org/markup-compatibility/2006" xmlns:m="http://schemas.openxmlformats.org/officeDocument/2006/math" xmlns:aink="http://schemas.microsoft.com/office/drawing/2016/ink" xmlns:am3d="http://schemas.microsoft.com/office/drawing/2017/model3d" xmlns:oel="http://schemas.microsoft.com/office/2019/extlst" xmlns:r="http://schemas.openxmlformats.org/officeDocument/2006/relationships" xmlns:wp14="http://schemas.microsoft.com/office/word/2010/wordprocessingDrawing" xmlns:wp="http://schemas.openxmlformats.org/drawingml/2006/wordprocessingDrawing" xmlns:wpg="http://schemas.microsoft.com/office/word/2010/wordprocessingGroup" xmlns:wpi="http://schemas.microsoft.com/office/word/2010/wordprocessingInk" xmlns:wps="http://schemas.microsoft.com/office/word/2010/wordprocessingShape" xmlns:o="urn:schemas-microsoft-com:office:office" xmlns:v="urn:schemas-microsoft-com:vml" xmlns:w10="urn:schemas-microsoft-com:office:word" xmlns:w="http://schemas.openxmlformats.org/wordprocessingml/2006/main" xmlns:w14="http://schemas.microsoft.com/office/word/2010/wordml" xmlns:w15="http://schemas.microsoft.com/office/word/2012/wordml" xmlns:w16cex="http://schemas.microsoft.com/office/word/2018/wordml/cex" xmlns:w16cid="http://schemas.microsoft.com/office/word/2016/wordml/cid" xmlns:w16="http://schemas.microsoft.com/office/word/2018/wordml" xmlns:w16sdtdh="http://schemas.microsoft.com/office/word/2020/wordml/sdtdatahash" xmlns:w16sdtfl="http://schemas.microsoft.com/office/word/2024/wordml/sdtformatlock" xmlns:w16se="http://schemas.microsoft.com/office/word/2015/wordml/symex" xmlns:w16du="http://schemas.microsoft.com/office/word/2023/wordml/word16du" xmlns:wne="http://schemas.microsoft.com/office/word/2006/wordml" mc:Ignorable="w14 w15 w16se w16cid w16 w16cex w16sdtdh w16sdtfl w16du wp14">
   <w:abstractNum w:abstractNumId="0" w15:restartNumberingAfterBreak="0">
     <w:nsid w:val="42F43C48"/>
     <w:multiLevelType w:val="hybridMultilevel"/>
@@ -5468,7 +5795,7 @@
 </file>
 
 <file path=word/styles.xml><?xml version="1.0" encoding="utf-8"?>
-<w:styles xmlns:mc="http://schemas.openxmlformats.org/markup-compatibility/2006" xmlns:r="http://schemas.openxmlformats.org/officeDocument/2006/relationships" xmlns:w="http://schemas.openxmlformats.org/wordprocessingml/2006/main" xmlns:w14="http://schemas.microsoft.com/office/word/2010/wordml" xmlns:w15="http://schemas.microsoft.com/office/word/2012/wordml" xmlns:w16cex="http://schemas.microsoft.com/office/word/2018/wordml/cex" xmlns:w16cid="http://schemas.microsoft.com/office/word/2016/wordml/cid" xmlns:w16="http://schemas.microsoft.com/office/word/2018/wordml" xmlns:w16du="http://schemas.microsoft.com/office/word/2023/wordml/word16du" xmlns:w16sdtdh="http://schemas.microsoft.com/office/word/2020/wordml/sdtdatahash" xmlns:w16sdtfl="http://schemas.microsoft.com/office/word/2024/wordml/sdtformatlock" xmlns:w16se="http://schemas.microsoft.com/office/word/2015/wordml/symex" mc:Ignorable="w14 w15 w16se w16cid w16 w16cex w16sdtdh w16sdtfl w16du">
+<w:styles xmlns:mc="http://schemas.openxmlformats.org/markup-compatibility/2006" xmlns:r="http://schemas.openxmlformats.org/officeDocument/2006/relationships" xmlns:w="http://schemas.openxmlformats.org/wordprocessingml/2006/main" xmlns:w14="http://schemas.microsoft.com/office/word/2010/wordml" xmlns:w15="http://schemas.microsoft.com/office/word/2012/wordml" xmlns:w16cex="http://schemas.microsoft.com/office/word/2018/wordml/cex" xmlns:w16cid="http://schemas.microsoft.com/office/word/2016/wordml/cid" xmlns:w16="http://schemas.microsoft.com/office/word/2018/wordml" xmlns:w16sdtdh="http://schemas.microsoft.com/office/word/2020/wordml/sdtdatahash" xmlns:w16sdtfl="http://schemas.microsoft.com/office/word/2024/wordml/sdtformatlock" xmlns:w16se="http://schemas.microsoft.com/office/word/2015/wordml/symex" xmlns:w16du="http://schemas.microsoft.com/office/word/2023/wordml/word16du" mc:Ignorable="w14 w15 w16se w16cid w16 w16cex w16sdtdh w16sdtfl w16du">
   <w:docDefaults>
     <w:rPrDefault>
       <w:rPr>

</xml_diff>